<commit_message>
Ajuste APA: todo el texto en negro y referencias con sangria francesa
</commit_message>
<xml_diff>
--- a/documentos-modulo1/Trabajo_Modulo1_Evolti.docx
+++ b/documentos-modulo1/Trabajo_Modulo1_Evolti.docx
@@ -2,41 +2,6 @@
 <file path=word/document.xml><?xml version="1.0" encoding="utf-8"?>
 <w:document xmlns:wpc="http://schemas.microsoft.com/office/word/2010/wordprocessingCanvas" xmlns:mo="http://schemas.microsoft.com/office/mac/office/2008/main" xmlns:mc="http://schemas.openxmlformats.org/markup-compatibility/2006" xmlns:mv="urn:schemas-microsoft-com:mac:vml" xmlns:o="urn:schemas-microsoft-com:office:office" xmlns:r="http://schemas.openxmlformats.org/officeDocument/2006/relationships" xmlns:m="http://schemas.openxmlformats.org/officeDocument/2006/math" xmlns:v="urn:schemas-microsoft-com:vml" xmlns:wp14="http://schemas.microsoft.com/office/word/2010/wordprocessingDrawing" xmlns:wp="http://schemas.openxmlformats.org/drawingml/2006/wordprocessingDrawing" xmlns:w10="urn:schemas-microsoft-com:office:word" xmlns:w="http://schemas.openxmlformats.org/wordprocessingml/2006/main" xmlns:w14="http://schemas.microsoft.com/office/word/2010/wordml" xmlns:wpg="http://schemas.microsoft.com/office/word/2010/wordprocessingGroup" xmlns:wpi="http://schemas.microsoft.com/office/word/2010/wordprocessingInk" xmlns:wne="http://schemas.microsoft.com/office/word/2006/wordml" xmlns:wps="http://schemas.microsoft.com/office/word/2010/wordprocessingShape" mc:Ignorable="w14 wp14">
   <w:body>
-    <w:p/>
-    <w:p/>
-    <w:p/>
-    <w:p>
-      <w:pPr>
-        <w:jc w:val="center"/>
-      </w:pPr>
-      <w:r>
-        <w:rPr>
-          <w:rFonts w:ascii="Arial" w:hAnsi="Arial"/>
-          <w:b/>
-          <w:i w:val="0"/>
-          <w:color w:val="1F3864"/>
-          <w:sz w:val="36"/>
-        </w:rPr>
-        <w:t>Diagnóstico y Plan de Transformación del Proceso de Compras</w:t>
-        <w:br/>
-        <w:t>hacia un Modelo de Procurement Estratégico</w:t>
-      </w:r>
-    </w:p>
-    <w:p>
-      <w:pPr>
-        <w:jc w:val="center"/>
-      </w:pPr>
-      <w:r>
-        <w:rPr>
-          <w:rFonts w:ascii="Arial" w:hAnsi="Arial"/>
-          <w:b w:val="0"/>
-          <w:i/>
-          <w:color w:val="0B6E4F"/>
-          <w:sz w:val="26"/>
-        </w:rPr>
-        <w:t>Caso de estudio: Evolti — Desarrollo y construcción de granjas solares</w:t>
-      </w:r>
-    </w:p>
     <w:p/>
     <w:p/>
     <w:p/>
@@ -50,6 +15,42 @@
           <w:rFonts w:ascii="Arial" w:hAnsi="Arial"/>
           <w:b/>
           <w:i w:val="0"/>
+          <w:color w:val="000000"/>
+          <w:sz w:val="32"/>
+        </w:rPr>
+        <w:t>Diagnóstico y Plan de Transformación del Proceso de Compras hacia un Modelo de Procurement Estratégico</w:t>
+      </w:r>
+    </w:p>
+    <w:p>
+      <w:pPr>
+        <w:jc w:val="center"/>
+      </w:pPr>
+      <w:r>
+        <w:rPr>
+          <w:rFonts w:ascii="Arial" w:hAnsi="Arial"/>
+          <w:b w:val="0"/>
+          <w:i/>
+          <w:color w:val="000000"/>
+          <w:sz w:val="24"/>
+        </w:rPr>
+        <w:t>Caso de estudio: Evolti — Desarrollo y construcción de granjas solares</w:t>
+      </w:r>
+    </w:p>
+    <w:p/>
+    <w:p/>
+    <w:p/>
+    <w:p/>
+    <w:p/>
+    <w:p>
+      <w:pPr>
+        <w:jc w:val="center"/>
+      </w:pPr>
+      <w:r>
+        <w:rPr>
+          <w:rFonts w:ascii="Arial" w:hAnsi="Arial"/>
+          <w:b/>
+          <w:i w:val="0"/>
+          <w:color w:val="000000"/>
           <w:sz w:val="22"/>
         </w:rPr>
         <w:t xml:space="preserve">Presentado por: </w:t>
@@ -59,6 +60,7 @@
           <w:rFonts w:ascii="Arial" w:hAnsi="Arial"/>
           <w:b w:val="0"/>
           <w:i w:val="0"/>
+          <w:color w:val="000000"/>
           <w:sz w:val="22"/>
         </w:rPr>
         <w:t>[Tu nombre completo]</w:t>
@@ -73,6 +75,7 @@
           <w:rFonts w:ascii="Arial" w:hAnsi="Arial"/>
           <w:b/>
           <w:i w:val="0"/>
+          <w:color w:val="000000"/>
           <w:sz w:val="22"/>
         </w:rPr>
         <w:t xml:space="preserve">Programa: </w:t>
@@ -82,6 +85,7 @@
           <w:rFonts w:ascii="Arial" w:hAnsi="Arial"/>
           <w:b w:val="0"/>
           <w:i w:val="0"/>
+          <w:color w:val="000000"/>
           <w:sz w:val="22"/>
         </w:rPr>
         <w:t>Diplomado en Procurement Estratégico y Abastecimiento Sostenible</w:t>
@@ -96,6 +100,7 @@
           <w:rFonts w:ascii="Arial" w:hAnsi="Arial"/>
           <w:b/>
           <w:i w:val="0"/>
+          <w:color w:val="000000"/>
           <w:sz w:val="22"/>
         </w:rPr>
         <w:t xml:space="preserve">Módulo 1: </w:t>
@@ -105,6 +110,7 @@
           <w:rFonts w:ascii="Arial" w:hAnsi="Arial"/>
           <w:b w:val="0"/>
           <w:i w:val="0"/>
+          <w:color w:val="000000"/>
           <w:sz w:val="22"/>
         </w:rPr>
         <w:t>Fundamentos del Procurement Estratégico</w:t>
@@ -119,6 +125,7 @@
           <w:rFonts w:ascii="Arial" w:hAnsi="Arial"/>
           <w:b/>
           <w:i w:val="0"/>
+          <w:color w:val="000000"/>
           <w:sz w:val="22"/>
         </w:rPr>
         <w:t xml:space="preserve">Institución: </w:t>
@@ -128,6 +135,7 @@
           <w:rFonts w:ascii="Arial" w:hAnsi="Arial"/>
           <w:b w:val="0"/>
           <w:i w:val="0"/>
+          <w:color w:val="000000"/>
           <w:sz w:val="22"/>
         </w:rPr>
         <w:t>Pontificia Universidad Javeriana Cali</w:t>
@@ -142,6 +150,7 @@
           <w:rFonts w:ascii="Arial" w:hAnsi="Arial"/>
           <w:b/>
           <w:i w:val="0"/>
+          <w:color w:val="000000"/>
           <w:sz w:val="22"/>
         </w:rPr>
         <w:t xml:space="preserve">Rol asumido: </w:t>
@@ -151,6 +160,7 @@
           <w:rFonts w:ascii="Arial" w:hAnsi="Arial"/>
           <w:b w:val="0"/>
           <w:i w:val="0"/>
+          <w:color w:val="000000"/>
           <w:sz w:val="22"/>
         </w:rPr>
         <w:t>Consultora estratégica de abastecimiento</w:t>
@@ -165,6 +175,7 @@
           <w:rFonts w:ascii="Arial" w:hAnsi="Arial"/>
           <w:b/>
           <w:i w:val="0"/>
+          <w:color w:val="000000"/>
           <w:sz w:val="22"/>
         </w:rPr>
         <w:t xml:space="preserve">Fecha: </w:t>
@@ -174,6 +185,7 @@
           <w:rFonts w:ascii="Arial" w:hAnsi="Arial"/>
           <w:b w:val="0"/>
           <w:i w:val="0"/>
+          <w:color w:val="000000"/>
           <w:sz w:val="22"/>
         </w:rPr>
         <w:t>[Fecha de entrega]</w:t>
@@ -188,14 +200,15 @@
       <w:pPr>
         <w:keepNext/>
         <w:spacing w:before="280" w:after="120"/>
+        <w:jc w:val="center"/>
       </w:pPr>
       <w:r>
         <w:rPr>
           <w:rFonts w:ascii="Arial" w:hAnsi="Arial"/>
           <w:b/>
           <w:i w:val="0"/>
-          <w:color w:val="1F3864"/>
-          <w:sz w:val="26"/>
+          <w:color w:val="000000"/>
+          <w:sz w:val="24"/>
         </w:rPr>
         <w:t>Introducción</w:t>
       </w:r>
@@ -209,6 +222,7 @@
           <w:rFonts w:ascii="Arial" w:hAnsi="Arial"/>
           <w:b w:val="0"/>
           <w:i w:val="0"/>
+          <w:color w:val="000000"/>
           <w:sz w:val="22"/>
         </w:rPr>
         <w:t>El presente trabajo lo desarrollo asumiendo el rol de consultora estratégica de abastecimiento para Evolti, una empresa del sector de energía solar dedicada al desarrollo y la construcción de granjas solares. Elegí esta organización porque actualmente me desempeño como analista de compras en ella y, aunque llevo poco tiempo en el área, esa cercanía con el día a día me permite observar de primera mano cómo funciona el proceso y dónde están las oportunidades de mejora.</w:t>
@@ -223,6 +237,7 @@
           <w:rFonts w:ascii="Arial" w:hAnsi="Arial"/>
           <w:b w:val="0"/>
           <w:i w:val="0"/>
+          <w:color w:val="000000"/>
           <w:sz w:val="22"/>
         </w:rPr>
         <w:t>Mi objetivo es aplicar los conceptos vistos en el Módulo 1 —la evolución del procurement estratégico, el rol estratégico del área de compras, el gobierno de compras (procurement governance), los KPIs y la gestión del gasto (spend analysis)— para elaborar un diagnóstico del modelo actual y proponer un plan de transformación que ayude a Evolti a pasar de un esquema táctico y reactivo hacia uno más estratégico y analítico. Aclaro que parte de las cifras que utilizo son estimaciones de trabajo (con fines académicos), porque todavía estoy conociendo a fondo la información y prefiero ser transparente en eso; sin embargo, los órdenes de magnitud son coherentes con lo que se observa en proyectos de este tipo.</w:t>
@@ -232,14 +247,15 @@
       <w:pPr>
         <w:keepNext/>
         <w:spacing w:before="280" w:after="120"/>
+        <w:jc w:val="center"/>
       </w:pPr>
       <w:r>
         <w:rPr>
           <w:rFonts w:ascii="Arial" w:hAnsi="Arial"/>
           <w:b/>
           <w:i w:val="0"/>
-          <w:color w:val="1F3864"/>
-          <w:sz w:val="26"/>
+          <w:color w:val="000000"/>
+          <w:sz w:val="24"/>
         </w:rPr>
         <w:t>1. Caracterización de la organización</w:t>
       </w:r>
@@ -253,6 +269,7 @@
           <w:rFonts w:ascii="Arial" w:hAnsi="Arial"/>
           <w:b w:val="0"/>
           <w:i w:val="0"/>
+          <w:color w:val="000000"/>
           <w:sz w:val="22"/>
         </w:rPr>
         <w:t>Antes de entrar al diagnóstico, describo brevemente a la organización para entender su contexto de compras, porque no es lo mismo comprar para una empresa de servicios que para una que construye infraestructura.</w:t>
@@ -268,8 +285,8 @@
           <w:rFonts w:ascii="Arial" w:hAnsi="Arial"/>
           <w:b/>
           <w:i w:val="0"/>
-          <w:color w:val="0B6E4F"/>
-          <w:sz w:val="23"/>
+          <w:color w:val="000000"/>
+          <w:sz w:val="22"/>
         </w:rPr>
         <w:t>Tipo de organización y sector económico</w:t>
       </w:r>
@@ -283,6 +300,7 @@
           <w:rFonts w:ascii="Arial" w:hAnsi="Arial"/>
           <w:b w:val="0"/>
           <w:i w:val="0"/>
+          <w:color w:val="000000"/>
           <w:sz w:val="22"/>
         </w:rPr>
         <w:t>Evolti es una empresa privada del sector de energías renovables, específicamente energía solar fotovoltaica. Su actividad principal es el desarrollo, la ingeniería y la construcción (modelo tipo EPC: ingeniería, aprovisionamiento y construcción) de granjas solares, es decir, plantas de generación de energía a partir del sol. Esto significa que su negocio combina componentes de ingeniería, de construcción y de compras técnicas especializadas, lo que hace que el abastecimiento sea un factor crítico para cumplir los cronogramas y los presupuestos de cada proyecto.</w:t>
@@ -298,8 +316,8 @@
           <w:rFonts w:ascii="Arial" w:hAnsi="Arial"/>
           <w:b/>
           <w:i w:val="0"/>
-          <w:color w:val="0B6E4F"/>
-          <w:sz w:val="23"/>
+          <w:color w:val="000000"/>
+          <w:sz w:val="22"/>
         </w:rPr>
         <w:t>Tamaño</w:t>
       </w:r>
@@ -313,6 +331,7 @@
           <w:rFonts w:ascii="Arial" w:hAnsi="Arial"/>
           <w:b w:val="0"/>
           <w:i w:val="0"/>
+          <w:color w:val="000000"/>
           <w:sz w:val="22"/>
         </w:rPr>
         <w:t>Para efectos de este trabajo la ubico como una empresa mediana en crecimiento, con una operación organizada por proyectos. El gasto en compras y contratación (paneles, estructuras, obra civil, equipos eléctricos y servicios) representa una porción muy alta del costo total de cada proyecto, característica típica de las empresas EPC, donde el rubro de materiales y subcontratos suele superar el 70 % del valor de la obra. Por eso el área de compras tiene un peso enorme en el resultado final del negocio, aunque a veces desde adentro no se le da esa importancia.</w:t>
@@ -328,8 +347,8 @@
           <w:rFonts w:ascii="Arial" w:hAnsi="Arial"/>
           <w:b/>
           <w:i w:val="0"/>
-          <w:color w:val="0B6E4F"/>
-          <w:sz w:val="23"/>
+          <w:color w:val="000000"/>
+          <w:sz w:val="22"/>
         </w:rPr>
         <w:t>Principales categorías de compra</w:t>
       </w:r>
@@ -343,6 +362,7 @@
           <w:rFonts w:ascii="Arial" w:hAnsi="Arial"/>
           <w:b w:val="0"/>
           <w:i w:val="0"/>
+          <w:color w:val="000000"/>
           <w:sz w:val="22"/>
         </w:rPr>
         <w:t>Las principales categorías que identifico en Evolti son:</w:t>
@@ -358,6 +378,7 @@
           <w:rFonts w:ascii="Arial" w:hAnsi="Arial"/>
           <w:b w:val="0"/>
           <w:i w:val="0"/>
+          <w:color w:val="000000"/>
           <w:sz w:val="22"/>
         </w:rPr>
         <w:t>Componentes fotovoltaicos: paneles/módulos solares, inversores y equipos de conversión de energía.</w:t>
@@ -373,6 +394,7 @@
           <w:rFonts w:ascii="Arial" w:hAnsi="Arial"/>
           <w:b w:val="0"/>
           <w:i w:val="0"/>
+          <w:color w:val="000000"/>
           <w:sz w:val="22"/>
         </w:rPr>
         <w:t>Estructuras y soportería: sistemas de montaje (fijos o con seguidores), estructuras metálicas y anclajes.</w:t>
@@ -388,6 +410,7 @@
           <w:rFonts w:ascii="Arial" w:hAnsi="Arial"/>
           <w:b w:val="0"/>
           <w:i w:val="0"/>
+          <w:color w:val="000000"/>
           <w:sz w:val="22"/>
         </w:rPr>
         <w:t>Materiales eléctricos: cableado, tableros, transformadores, protecciones y sistemas de conexión (BOS).</w:t>
@@ -403,6 +426,7 @@
           <w:rFonts w:ascii="Arial" w:hAnsi="Arial"/>
           <w:b w:val="0"/>
           <w:i w:val="0"/>
+          <w:color w:val="000000"/>
           <w:sz w:val="22"/>
         </w:rPr>
         <w:t>Obra civil y montaje: movimientos de tierra, cimentaciones, cerramientos y mano de obra subcontratada.</w:t>
@@ -418,6 +442,7 @@
           <w:rFonts w:ascii="Arial" w:hAnsi="Arial"/>
           <w:b w:val="0"/>
           <w:i w:val="0"/>
+          <w:color w:val="000000"/>
           <w:sz w:val="22"/>
         </w:rPr>
         <w:t>Servicios profesionales y logística: ingeniería, transporte de carga pesada, alquiler de maquinaria y pólizas.</w:t>
@@ -433,8 +458,8 @@
           <w:rFonts w:ascii="Arial" w:hAnsi="Arial"/>
           <w:b/>
           <w:i w:val="0"/>
-          <w:color w:val="0B6E4F"/>
-          <w:sz w:val="23"/>
+          <w:color w:val="000000"/>
+          <w:sz w:val="22"/>
         </w:rPr>
         <w:t>Riesgos visibles del proceso de compras</w:t>
       </w:r>
@@ -448,6 +473,7 @@
           <w:rFonts w:ascii="Arial" w:hAnsi="Arial"/>
           <w:b w:val="0"/>
           <w:i w:val="0"/>
+          <w:color w:val="000000"/>
           <w:sz w:val="22"/>
         </w:rPr>
         <w:t>Desde mi observación en el día a día, los riesgos más visibles del proceso de compras son:</w:t>
@@ -463,6 +489,7 @@
           <w:rFonts w:ascii="Arial" w:hAnsi="Arial"/>
           <w:b w:val="0"/>
           <w:i w:val="0"/>
+          <w:color w:val="000000"/>
           <w:sz w:val="22"/>
         </w:rPr>
         <w:t>Alta dependencia de proveedores internacionales de paneles e inversores, lo que expone a la empresa a la volatilidad de precios, la tasa de cambio y los tiempos de importación.</w:t>
@@ -478,6 +505,7 @@
           <w:rFonts w:ascii="Arial" w:hAnsi="Arial"/>
           <w:b w:val="0"/>
           <w:i w:val="0"/>
+          <w:color w:val="000000"/>
           <w:sz w:val="22"/>
         </w:rPr>
         <w:t>Compras urgentes y a última hora cuando un proyecto se atrasa, que muchas veces se pagan más caras y sin comparar cotizaciones (esto se relaciona con lo que en el módulo se llama maverick spend).</w:t>
@@ -493,6 +521,7 @@
           <w:rFonts w:ascii="Arial" w:hAnsi="Arial"/>
           <w:b w:val="0"/>
           <w:i w:val="0"/>
+          <w:color w:val="000000"/>
           <w:sz w:val="22"/>
         </w:rPr>
         <w:t>Concentración del gasto en pocos proveedores críticos, sin un plan de contingencia claro si uno falla.</w:t>
@@ -508,6 +537,7 @@
           <w:rFonts w:ascii="Arial" w:hAnsi="Arial"/>
           <w:b w:val="0"/>
           <w:i w:val="0"/>
+          <w:color w:val="000000"/>
           <w:sz w:val="22"/>
         </w:rPr>
         <w:t>Trazabilidad limitada: la información de compras está dispersa en correos y archivos de Excel, lo que dificulta saber con certeza cuánto se gasta por categoría o por proveedor.</w:t>
@@ -523,6 +553,7 @@
           <w:rFonts w:ascii="Arial" w:hAnsi="Arial"/>
           <w:b w:val="0"/>
           <w:i w:val="0"/>
+          <w:color w:val="000000"/>
           <w:sz w:val="22"/>
         </w:rPr>
         <w:t>Riesgo de continuidad: si un panel o un transformador no llega a tiempo, se frena toda la obra, y el impacto económico de un día de retraso es alto.</w:t>
@@ -532,14 +563,15 @@
       <w:pPr>
         <w:keepNext/>
         <w:spacing w:before="280" w:after="120"/>
+        <w:jc w:val="center"/>
       </w:pPr>
       <w:r>
         <w:rPr>
           <w:rFonts w:ascii="Arial" w:hAnsi="Arial"/>
           <w:b/>
           <w:i w:val="0"/>
-          <w:color w:val="1F3864"/>
-          <w:sz w:val="26"/>
+          <w:color w:val="000000"/>
+          <w:sz w:val="24"/>
         </w:rPr>
         <w:t>2. Diagnóstico del modelo actual de compras</w:t>
       </w:r>
@@ -553,6 +585,7 @@
           <w:rFonts w:ascii="Arial" w:hAnsi="Arial"/>
           <w:b w:val="0"/>
           <w:i w:val="0"/>
+          <w:color w:val="000000"/>
           <w:sz w:val="22"/>
         </w:rPr>
         <w:t>En esta sección analizo el estado actual del proceso. Trato de ser honesta con lo que veo, sin exagerar, porque el propósito es mejorar y no criticar el trabajo de nadie.</w:t>
@@ -568,8 +601,8 @@
           <w:rFonts w:ascii="Arial" w:hAnsi="Arial"/>
           <w:b/>
           <w:i w:val="0"/>
-          <w:color w:val="0B6E4F"/>
-          <w:sz w:val="23"/>
+          <w:color w:val="000000"/>
+          <w:sz w:val="22"/>
         </w:rPr>
         <w:t>Nivel de madurez del procurement</w:t>
       </w:r>
@@ -583,9 +616,41 @@
           <w:rFonts w:ascii="Arial" w:hAnsi="Arial"/>
           <w:b w:val="0"/>
           <w:i w:val="0"/>
+          <w:color w:val="000000"/>
           <w:sz w:val="22"/>
         </w:rPr>
-        <w:t>Utilizando la idea de la evolución del procurement vista en el módulo (el paso de un rol de “purchasing” meramente operativo hacia un “supply management” estratégico), ubico a Evolti en un nivel de madurez táctico–reactivo, con algunos avances puntuales. Es decir, compras cumple bien la función de “conseguir lo que se necesita”, pero todavía actúa más como un área que responde a pedidos que como un área que planifica y aporta valor estratégico. La siguiente tabla resume cómo veo cada dimensión:</w:t>
+        <w:t>Utilizando la idea de la evolución del procurement vista en el módulo (el paso de un rol de “purchasing” meramente operativo hacia un “supply management” estratégico), ubico a Evolti en un nivel de madurez táctico–reactivo, con algunos avances puntuales. Es decir, compras cumple bien la función de “conseguir lo que se necesita”, pero todavía actúa más como un área que responde a pedidos que como un área que planifica y aporta valor estratégico. La Tabla 1 resume cómo veo cada dimensión.</w:t>
+      </w:r>
+    </w:p>
+    <w:p>
+      <w:pPr>
+        <w:spacing w:before="120" w:after="0"/>
+      </w:pPr>
+      <w:r>
+        <w:rPr>
+          <w:rFonts w:ascii="Arial" w:hAnsi="Arial"/>
+          <w:b/>
+          <w:i w:val="0"/>
+          <w:color w:val="000000"/>
+          <w:sz w:val="20"/>
+        </w:rPr>
+        <w:t>Tabla 1</w:t>
+      </w:r>
+    </w:p>
+    <w:p>
+      <w:pPr>
+        <w:spacing w:after="160"/>
+        <w:jc w:val="left"/>
+      </w:pPr>
+      <w:r>
+        <w:rPr>
+          <w:rFonts w:ascii="Arial" w:hAnsi="Arial"/>
+          <w:b w:val="0"/>
+          <w:i/>
+          <w:color w:val="000000"/>
+          <w:sz w:val="18"/>
+        </w:rPr>
+        <w:t>Diagnóstico de madurez del procurement en Evolti</w:t>
       </w:r>
     </w:p>
     <w:tbl>
@@ -596,15 +661,15 @@
         <w:tblLook w:firstColumn="1" w:firstRow="1" w:lastColumn="0" w:lastRow="0" w:noHBand="0" w:noVBand="1" w:val="04A0"/>
       </w:tblPr>
       <w:tblGrid>
-        <w:gridCol w:w="2946"/>
-        <w:gridCol w:w="2946"/>
-        <w:gridCol w:w="2946"/>
+        <w:gridCol w:w="3120"/>
+        <w:gridCol w:w="3120"/>
+        <w:gridCol w:w="3120"/>
       </w:tblGrid>
       <w:tr>
         <w:tc>
           <w:tcPr>
             <w:tcW w:type="dxa" w:w="2304"/>
-            <w:shd w:val="clear" w:color="auto" w:fill="1F3864"/>
+            <w:shd w:val="clear" w:color="auto" w:fill="D9D9D9"/>
           </w:tcPr>
           <w:p>
             <w:r/>
@@ -613,7 +678,7 @@
                 <w:rFonts w:ascii="Arial" w:hAnsi="Arial"/>
                 <w:b/>
                 <w:i w:val="0"/>
-                <w:color w:val="FFFFFF"/>
+                <w:color w:val="000000"/>
                 <w:sz w:val="18"/>
               </w:rPr>
               <w:t>Dimensión</w:t>
@@ -623,7 +688,7 @@
         <w:tc>
           <w:tcPr>
             <w:tcW w:type="dxa" w:w="5184"/>
-            <w:shd w:val="clear" w:color="auto" w:fill="1F3864"/>
+            <w:shd w:val="clear" w:color="auto" w:fill="D9D9D9"/>
           </w:tcPr>
           <w:p>
             <w:r/>
@@ -632,7 +697,7 @@
                 <w:rFonts w:ascii="Arial" w:hAnsi="Arial"/>
                 <w:b/>
                 <w:i w:val="0"/>
-                <w:color w:val="FFFFFF"/>
+                <w:color w:val="000000"/>
                 <w:sz w:val="18"/>
               </w:rPr>
               <w:t>Situación actual observada</w:t>
@@ -642,7 +707,7 @@
         <w:tc>
           <w:tcPr>
             <w:tcW w:type="dxa" w:w="1296"/>
-            <w:shd w:val="clear" w:color="auto" w:fill="1F3864"/>
+            <w:shd w:val="clear" w:color="auto" w:fill="D9D9D9"/>
           </w:tcPr>
           <w:p>
             <w:r/>
@@ -651,7 +716,7 @@
                 <w:rFonts w:ascii="Arial" w:hAnsi="Arial"/>
                 <w:b/>
                 <w:i w:val="0"/>
-                <w:color w:val="FFFFFF"/>
+                <w:color w:val="000000"/>
                 <w:sz w:val="18"/>
               </w:rPr>
               <w:t>Nivel</w:t>
@@ -671,6 +736,7 @@
                 <w:rFonts w:ascii="Arial" w:hAnsi="Arial"/>
                 <w:b w:val="0"/>
                 <w:i w:val="0"/>
+                <w:color w:val="000000"/>
                 <w:sz w:val="18"/>
               </w:rPr>
               <w:t>Enfoque del área</w:t>
@@ -688,6 +754,7 @@
                 <w:rFonts w:ascii="Arial" w:hAnsi="Arial"/>
                 <w:b w:val="0"/>
                 <w:i w:val="0"/>
+                <w:color w:val="000000"/>
                 <w:sz w:val="18"/>
               </w:rPr>
               <w:t>Reactivo: responde a requisiciones de obra, poca planeación anticipada.</w:t>
@@ -705,6 +772,7 @@
                 <w:rFonts w:ascii="Arial" w:hAnsi="Arial"/>
                 <w:b w:val="0"/>
                 <w:i w:val="0"/>
+                <w:color w:val="000000"/>
                 <w:sz w:val="18"/>
               </w:rPr>
               <w:t>Táctico</w:t>
@@ -724,6 +792,7 @@
                 <w:rFonts w:ascii="Arial" w:hAnsi="Arial"/>
                 <w:b w:val="0"/>
                 <w:i w:val="0"/>
+                <w:color w:val="000000"/>
                 <w:sz w:val="18"/>
               </w:rPr>
               <w:t>Uso de datos</w:t>
@@ -741,6 +810,7 @@
                 <w:rFonts w:ascii="Arial" w:hAnsi="Arial"/>
                 <w:b w:val="0"/>
                 <w:i w:val="0"/>
+                <w:color w:val="000000"/>
                 <w:sz w:val="18"/>
               </w:rPr>
               <w:t>Información en Excel y correos; no hay spend analysis formal.</w:t>
@@ -758,6 +828,7 @@
                 <w:rFonts w:ascii="Arial" w:hAnsi="Arial"/>
                 <w:b w:val="0"/>
                 <w:i w:val="0"/>
+                <w:color w:val="000000"/>
                 <w:sz w:val="18"/>
               </w:rPr>
               <w:t>Inicial</w:t>
@@ -777,6 +848,7 @@
                 <w:rFonts w:ascii="Arial" w:hAnsi="Arial"/>
                 <w:b w:val="0"/>
                 <w:i w:val="0"/>
+                <w:color w:val="000000"/>
                 <w:sz w:val="18"/>
               </w:rPr>
               <w:t>Relación con proveedores</w:t>
@@ -794,6 +866,7 @@
                 <w:rFonts w:ascii="Arial" w:hAnsi="Arial"/>
                 <w:b w:val="0"/>
                 <w:i w:val="0"/>
+                <w:color w:val="000000"/>
                 <w:sz w:val="18"/>
               </w:rPr>
               <w:t>Transaccional; se elige mucho por precio y disponibilidad.</w:t>
@@ -811,6 +884,7 @@
                 <w:rFonts w:ascii="Arial" w:hAnsi="Arial"/>
                 <w:b w:val="0"/>
                 <w:i w:val="0"/>
+                <w:color w:val="000000"/>
                 <w:sz w:val="18"/>
               </w:rPr>
               <w:t>Básico</w:t>
@@ -830,6 +904,7 @@
                 <w:rFonts w:ascii="Arial" w:hAnsi="Arial"/>
                 <w:b w:val="0"/>
                 <w:i w:val="0"/>
+                <w:color w:val="000000"/>
                 <w:sz w:val="18"/>
               </w:rPr>
               <w:t>Gobierno y políticas</w:t>
@@ -847,6 +922,7 @@
                 <w:rFonts w:ascii="Arial" w:hAnsi="Arial"/>
                 <w:b w:val="0"/>
                 <w:i w:val="0"/>
+                <w:color w:val="000000"/>
                 <w:sz w:val="18"/>
               </w:rPr>
               <w:t>Existen prácticas, pero poco documentadas y con controles informales.</w:t>
@@ -864,6 +940,7 @@
                 <w:rFonts w:ascii="Arial" w:hAnsi="Arial"/>
                 <w:b w:val="0"/>
                 <w:i w:val="0"/>
+                <w:color w:val="000000"/>
                 <w:sz w:val="18"/>
               </w:rPr>
               <w:t>Bajo</w:t>
@@ -883,6 +960,7 @@
                 <w:rFonts w:ascii="Arial" w:hAnsi="Arial"/>
                 <w:b w:val="0"/>
                 <w:i w:val="0"/>
+                <w:color w:val="000000"/>
                 <w:sz w:val="18"/>
               </w:rPr>
               <w:t>Indicadores (KPIs)</w:t>
@@ -900,6 +978,7 @@
                 <w:rFonts w:ascii="Arial" w:hAnsi="Arial"/>
                 <w:b w:val="0"/>
                 <w:i w:val="0"/>
+                <w:color w:val="000000"/>
                 <w:sz w:val="18"/>
               </w:rPr>
               <w:t>Se mide poco; casi todo es “cuánto costó” y “si llegó”.</w:t>
@@ -917,6 +996,7 @@
                 <w:rFonts w:ascii="Arial" w:hAnsi="Arial"/>
                 <w:b w:val="0"/>
                 <w:i w:val="0"/>
+                <w:color w:val="000000"/>
                 <w:sz w:val="18"/>
               </w:rPr>
               <w:t>Inicial</w:t>
@@ -936,6 +1016,7 @@
                 <w:rFonts w:ascii="Arial" w:hAnsi="Arial"/>
                 <w:b w:val="0"/>
                 <w:i w:val="0"/>
+                <w:color w:val="000000"/>
                 <w:sz w:val="18"/>
               </w:rPr>
               <w:t>Sostenibilidad</w:t>
@@ -953,6 +1034,7 @@
                 <w:rFonts w:ascii="Arial" w:hAnsi="Arial"/>
                 <w:b w:val="0"/>
                 <w:i w:val="0"/>
+                <w:color w:val="000000"/>
                 <w:sz w:val="18"/>
               </w:rPr>
               <w:t>No formalizada como criterio de compra todavía.</w:t>
@@ -970,6 +1052,7 @@
                 <w:rFonts w:ascii="Arial" w:hAnsi="Arial"/>
                 <w:b w:val="0"/>
                 <w:i w:val="0"/>
+                <w:color w:val="000000"/>
                 <w:sz w:val="18"/>
               </w:rPr>
               <w:t>Incipiente</w:t>
@@ -993,10 +1076,10 @@
           <w:rFonts w:ascii="Arial" w:hAnsi="Arial"/>
           <w:b w:val="0"/>
           <w:i/>
-          <w:color w:val="444444"/>
-          <w:sz w:val="17"/>
+          <w:color w:val="000000"/>
+          <w:sz w:val="18"/>
         </w:rPr>
-        <w:t>Tabla 1. Diagnóstico de madurez del procurement en Evolti (elaboración propia con base en el Módulo 1).</w:t>
+        <w:t>Nota. Elaboración propia con base en los contenidos del Módulo 1 (Pontificia Universidad Javeriana Cali, 2026).</w:t>
       </w:r>
     </w:p>
     <w:p>
@@ -1009,8 +1092,8 @@
           <w:rFonts w:ascii="Arial" w:hAnsi="Arial"/>
           <w:b/>
           <w:i w:val="0"/>
-          <w:color w:val="0B6E4F"/>
-          <w:sz w:val="23"/>
+          <w:color w:val="000000"/>
+          <w:sz w:val="22"/>
         </w:rPr>
         <w:t>Problemas operativos</w:t>
       </w:r>
@@ -1025,6 +1108,7 @@
           <w:rFonts w:ascii="Arial" w:hAnsi="Arial"/>
           <w:b w:val="0"/>
           <w:i w:val="0"/>
+          <w:color w:val="000000"/>
           <w:sz w:val="22"/>
         </w:rPr>
         <w:t>Requisiciones que llegan sin suficiente anticipación, lo que obliga a comprar contra reloj.</w:t>
@@ -1040,6 +1124,7 @@
           <w:rFonts w:ascii="Arial" w:hAnsi="Arial"/>
           <w:b w:val="0"/>
           <w:i w:val="0"/>
+          <w:color w:val="000000"/>
           <w:sz w:val="22"/>
         </w:rPr>
         <w:t>Falta de un catálogo o de especificaciones estandarizadas, por lo que cada compra se cotiza casi desde cero.</w:t>
@@ -1055,6 +1140,7 @@
           <w:rFonts w:ascii="Arial" w:hAnsi="Arial"/>
           <w:b w:val="0"/>
           <w:i w:val="0"/>
+          <w:color w:val="000000"/>
           <w:sz w:val="22"/>
         </w:rPr>
         <w:t>Cotizaciones y aprobaciones que se manejan por correo, sin un flujo claro ni un sistema que deje trazabilidad.</w:t>
@@ -1070,6 +1156,7 @@
           <w:rFonts w:ascii="Arial" w:hAnsi="Arial"/>
           <w:b w:val="0"/>
           <w:i w:val="0"/>
+          <w:color w:val="000000"/>
           <w:sz w:val="22"/>
         </w:rPr>
         <w:t>Poca visibilidad del gasto consolidado: cuesta responder rápido preguntas como “¿cuánto le compramos a este proveedor en el año?”.</w:t>
@@ -1085,8 +1172,8 @@
           <w:rFonts w:ascii="Arial" w:hAnsi="Arial"/>
           <w:b/>
           <w:i w:val="0"/>
-          <w:color w:val="0B6E4F"/>
-          <w:sz w:val="23"/>
+          <w:color w:val="000000"/>
+          <w:sz w:val="22"/>
         </w:rPr>
         <w:t>Riesgos de integridad o maverick spend</w:t>
       </w:r>
@@ -1100,6 +1187,7 @@
           <w:rFonts w:ascii="Arial" w:hAnsi="Arial"/>
           <w:b w:val="0"/>
           <w:i w:val="0"/>
+          <w:color w:val="000000"/>
           <w:sz w:val="22"/>
         </w:rPr>
         <w:t>El maverick spend (compras que se hacen por fuera de los canales y contratos definidos) es un riesgo real en un entorno de obra, donde la presión por cumplir el cronograma lleva a “saltarse” el proceso. En Evolti esto se ve, por ejemplo, cuando un frente de obra compra directamente un material urgente sin pasar por compras. Además del sobrecosto, esto reduce el control y abre la puerta a riesgos de integridad, como adjudicar siempre al mismo proveedor sin comparar, o la falta de segregación de funciones (que la misma persona pida, apruebe y reciba). El módulo insiste en que la separación entre solicitar, adjudicar y pagar es clave para la transparencia.</w:t>
@@ -1115,8 +1203,8 @@
           <w:rFonts w:ascii="Arial" w:hAnsi="Arial"/>
           <w:b/>
           <w:i w:val="0"/>
-          <w:color w:val="0B6E4F"/>
-          <w:sz w:val="23"/>
+          <w:color w:val="000000"/>
+          <w:sz w:val="22"/>
         </w:rPr>
         <w:t>Centralización vs. descentralización</w:t>
       </w:r>
@@ -1130,6 +1218,7 @@
           <w:rFonts w:ascii="Arial" w:hAnsi="Arial"/>
           <w:b w:val="0"/>
           <w:i w:val="0"/>
+          <w:color w:val="000000"/>
           <w:sz w:val="22"/>
         </w:rPr>
         <w:t>Hoy el modelo es mixto pero desordenado: existe un área de compras central, pero en la práctica los proyectos toman muchas decisiones de compra por su cuenta cuando hay urgencia. No es un modelo híbrido bien diseñado, sino más bien una descentralización “de hecho”. Esto genera duplicidad de esfuerzos y pérdida de poder de negociación, porque se compra lo mismo desde varios frentes en lugar de consolidar volúmenes.</w:t>
@@ -1145,8 +1234,8 @@
           <w:rFonts w:ascii="Arial" w:hAnsi="Arial"/>
           <w:b/>
           <w:i w:val="0"/>
-          <w:color w:val="0B6E4F"/>
-          <w:sz w:val="23"/>
+          <w:color w:val="000000"/>
+          <w:sz w:val="22"/>
         </w:rPr>
         <w:t>Principales debilidades del proceso</w:t>
       </w:r>
@@ -1161,6 +1250,7 @@
           <w:rFonts w:ascii="Arial" w:hAnsi="Arial"/>
           <w:b w:val="0"/>
           <w:i w:val="0"/>
+          <w:color w:val="000000"/>
           <w:sz w:val="22"/>
         </w:rPr>
         <w:t>Falta de información confiable y consolidada para tomar decisiones (no hay una base de datos limpia del gasto).</w:t>
@@ -1176,6 +1266,7 @@
           <w:rFonts w:ascii="Arial" w:hAnsi="Arial"/>
           <w:b w:val="0"/>
           <w:i w:val="0"/>
+          <w:color w:val="000000"/>
           <w:sz w:val="22"/>
         </w:rPr>
         <w:t>Ausencia de una segmentación del gasto que permita saber dónde enfocar el esfuerzo de negociación.</w:t>
@@ -1191,6 +1282,7 @@
           <w:rFonts w:ascii="Arial" w:hAnsi="Arial"/>
           <w:b w:val="0"/>
           <w:i w:val="0"/>
+          <w:color w:val="000000"/>
           <w:sz w:val="22"/>
         </w:rPr>
         <w:t>Controles internos y políticas poco formalizados.</w:t>
@@ -1206,6 +1298,7 @@
           <w:rFonts w:ascii="Arial" w:hAnsi="Arial"/>
           <w:b w:val="0"/>
           <w:i w:val="0"/>
+          <w:color w:val="000000"/>
           <w:sz w:val="22"/>
         </w:rPr>
         <w:t>Dependencia de pocos proveedores críticos sin plan de continuidad.</w:t>
@@ -1221,6 +1314,7 @@
           <w:rFonts w:ascii="Arial" w:hAnsi="Arial"/>
           <w:b w:val="0"/>
           <w:i w:val="0"/>
+          <w:color w:val="000000"/>
           <w:sz w:val="22"/>
         </w:rPr>
         <w:t>Medición débil del desempeño (pocos KPIs y casi ninguno estratégico).</w:t>
@@ -1230,14 +1324,15 @@
       <w:pPr>
         <w:keepNext/>
         <w:spacing w:before="280" w:after="120"/>
+        <w:jc w:val="center"/>
       </w:pPr>
       <w:r>
         <w:rPr>
           <w:rFonts w:ascii="Arial" w:hAnsi="Arial"/>
           <w:b/>
           <w:i w:val="0"/>
-          <w:color w:val="1F3864"/>
-          <w:sz w:val="26"/>
+          <w:color w:val="000000"/>
+          <w:sz w:val="24"/>
         </w:rPr>
         <w:t>3. Construcción del árbol de categorías</w:t>
       </w:r>
@@ -1251,9 +1346,41 @@
           <w:rFonts w:ascii="Arial" w:hAnsi="Arial"/>
           <w:b w:val="0"/>
           <w:i w:val="0"/>
+          <w:color w:val="000000"/>
           <w:sz w:val="22"/>
         </w:rPr>
-        <w:t>Siguiendo el paso 1 de la metodología de gestión del gasto del módulo, organizo el gasto en un árbol de categorías (Categoría → Subcategoría). Esto da visibilidad y permite después aplicar estrategias diferenciadas. Diseñé cuatro categorías principales con dos subcategorías cada una, pensadas para el negocio de granjas solares:</w:t>
+        <w:t>Siguiendo el paso 1 de la metodología de gestión del gasto del módulo, organizo el gasto en un árbol de categorías (Categoría → Subcategoría). Esto da visibilidad y permite después aplicar estrategias diferenciadas. Diseñé cuatro categorías principales con dos subcategorías cada una, pensadas para el negocio de granjas solares (ver Tabla 2).</w:t>
+      </w:r>
+    </w:p>
+    <w:p>
+      <w:pPr>
+        <w:spacing w:before="120" w:after="0"/>
+      </w:pPr>
+      <w:r>
+        <w:rPr>
+          <w:rFonts w:ascii="Arial" w:hAnsi="Arial"/>
+          <w:b/>
+          <w:i w:val="0"/>
+          <w:color w:val="000000"/>
+          <w:sz w:val="20"/>
+        </w:rPr>
+        <w:t>Tabla 2</w:t>
+      </w:r>
+    </w:p>
+    <w:p>
+      <w:pPr>
+        <w:spacing w:after="160"/>
+        <w:jc w:val="left"/>
+      </w:pPr>
+      <w:r>
+        <w:rPr>
+          <w:rFonts w:ascii="Arial" w:hAnsi="Arial"/>
+          <w:b w:val="0"/>
+          <w:i/>
+          <w:color w:val="000000"/>
+          <w:sz w:val="18"/>
+        </w:rPr>
+        <w:t>Árbol de categorías propuesto para Evolti</w:t>
       </w:r>
     </w:p>
     <w:tbl>
@@ -1264,14 +1391,14 @@
         <w:tblLook w:firstColumn="1" w:firstRow="1" w:lastColumn="0" w:lastRow="0" w:noHBand="0" w:noVBand="1" w:val="04A0"/>
       </w:tblPr>
       <w:tblGrid>
-        <w:gridCol w:w="4419"/>
-        <w:gridCol w:w="4419"/>
+        <w:gridCol w:w="4680"/>
+        <w:gridCol w:w="4680"/>
       </w:tblGrid>
       <w:tr>
         <w:tc>
           <w:tcPr>
             <w:tcW w:type="dxa" w:w="2880"/>
-            <w:shd w:val="clear" w:color="auto" w:fill="1F3864"/>
+            <w:shd w:val="clear" w:color="auto" w:fill="D9D9D9"/>
           </w:tcPr>
           <w:p>
             <w:r/>
@@ -1280,7 +1407,7 @@
                 <w:rFonts w:ascii="Arial" w:hAnsi="Arial"/>
                 <w:b/>
                 <w:i w:val="0"/>
-                <w:color w:val="FFFFFF"/>
+                <w:color w:val="000000"/>
                 <w:sz w:val="19"/>
               </w:rPr>
               <w:t>Categoría principal</w:t>
@@ -1290,7 +1417,7 @@
         <w:tc>
           <w:tcPr>
             <w:tcW w:type="dxa" w:w="5904"/>
-            <w:shd w:val="clear" w:color="auto" w:fill="1F3864"/>
+            <w:shd w:val="clear" w:color="auto" w:fill="D9D9D9"/>
           </w:tcPr>
           <w:p>
             <w:r/>
@@ -1299,7 +1426,7 @@
                 <w:rFonts w:ascii="Arial" w:hAnsi="Arial"/>
                 <w:b/>
                 <w:i w:val="0"/>
-                <w:color w:val="FFFFFF"/>
+                <w:color w:val="000000"/>
                 <w:sz w:val="19"/>
               </w:rPr>
               <w:t>Subcategorías</w:t>
@@ -1319,6 +1446,7 @@
                 <w:rFonts w:ascii="Arial" w:hAnsi="Arial"/>
                 <w:b w:val="0"/>
                 <w:i w:val="0"/>
+                <w:color w:val="000000"/>
                 <w:sz w:val="19"/>
               </w:rPr>
               <w:t>1. Componentes fotovoltaicos</w:t>
@@ -1336,6 +1464,7 @@
                 <w:rFonts w:ascii="Arial" w:hAnsi="Arial"/>
                 <w:b w:val="0"/>
                 <w:i w:val="0"/>
+                <w:color w:val="000000"/>
                 <w:sz w:val="19"/>
               </w:rPr>
               <w:t>1.1 Módulos/paneles solares   |   1.2 Inversores y equipos de conversión</w:t>
@@ -1355,6 +1484,7 @@
                 <w:rFonts w:ascii="Arial" w:hAnsi="Arial"/>
                 <w:b w:val="0"/>
                 <w:i w:val="0"/>
+                <w:color w:val="000000"/>
                 <w:sz w:val="19"/>
               </w:rPr>
               <w:t>2. Estructuras y montaje</w:t>
@@ -1372,6 +1502,7 @@
                 <w:rFonts w:ascii="Arial" w:hAnsi="Arial"/>
                 <w:b w:val="0"/>
                 <w:i w:val="0"/>
+                <w:color w:val="000000"/>
                 <w:sz w:val="19"/>
               </w:rPr>
               <w:t>2.1 Estructura de soporte (fija/seguidores)   |   2.2 Anclajes y cimentación</w:t>
@@ -1391,6 +1522,7 @@
                 <w:rFonts w:ascii="Arial" w:hAnsi="Arial"/>
                 <w:b w:val="0"/>
                 <w:i w:val="0"/>
+                <w:color w:val="000000"/>
                 <w:sz w:val="19"/>
               </w:rPr>
               <w:t>3. Materiales eléctricos (BOS)</w:t>
@@ -1408,6 +1540,7 @@
                 <w:rFonts w:ascii="Arial" w:hAnsi="Arial"/>
                 <w:b w:val="0"/>
                 <w:i w:val="0"/>
+                <w:color w:val="000000"/>
                 <w:sz w:val="19"/>
               </w:rPr>
               <w:t>3.1 Cableado y conexiones   |   3.2 Tableros, transformadores y protecciones</w:t>
@@ -1427,6 +1560,7 @@
                 <w:rFonts w:ascii="Arial" w:hAnsi="Arial"/>
                 <w:b w:val="0"/>
                 <w:i w:val="0"/>
+                <w:color w:val="000000"/>
                 <w:sz w:val="19"/>
               </w:rPr>
               <w:t>4. Obra civil y servicios</w:t>
@@ -1444,6 +1578,7 @@
                 <w:rFonts w:ascii="Arial" w:hAnsi="Arial"/>
                 <w:b w:val="0"/>
                 <w:i w:val="0"/>
+                <w:color w:val="000000"/>
                 <w:sz w:val="19"/>
               </w:rPr>
               <w:t>4.1 Movimientos de tierra y obra civil   |   4.2 Transporte, maquinaria y servicios de ingeniería</w:t>
@@ -1467,10 +1602,10 @@
           <w:rFonts w:ascii="Arial" w:hAnsi="Arial"/>
           <w:b w:val="0"/>
           <w:i/>
-          <w:color w:val="444444"/>
-          <w:sz w:val="17"/>
+          <w:color w:val="000000"/>
+          <w:sz w:val="18"/>
         </w:rPr>
-        <w:t>Tabla 2. Árbol de categorías propuesto para Evolti (Categoría → Subcategoría).</w:t>
+        <w:t>Nota. Elaboración propia.</w:t>
       </w:r>
     </w:p>
     <w:p>
@@ -1482,6 +1617,7 @@
           <w:rFonts w:ascii="Arial" w:hAnsi="Arial"/>
           <w:b w:val="0"/>
           <w:i w:val="0"/>
+          <w:color w:val="000000"/>
           <w:sz w:val="22"/>
         </w:rPr>
         <w:t>Este árbol es la base para el cubo del gasto y para el análisis de Pareto que desarrollo enseguida. La idea, como dice el módulo, es que “no hay estrategia sin segmentación del gasto”.</w:t>
@@ -1491,14 +1627,15 @@
       <w:pPr>
         <w:keepNext/>
         <w:spacing w:before="280" w:after="120"/>
+        <w:jc w:val="center"/>
       </w:pPr>
       <w:r>
         <w:rPr>
           <w:rFonts w:ascii="Arial" w:hAnsi="Arial"/>
           <w:b/>
           <w:i w:val="0"/>
-          <w:color w:val="1F3864"/>
-          <w:sz w:val="26"/>
+          <w:color w:val="000000"/>
+          <w:sz w:val="24"/>
         </w:rPr>
         <w:t>4. Análisis del gasto (Spend Analysis)</w:t>
       </w:r>
@@ -1512,6 +1649,7 @@
           <w:rFonts w:ascii="Arial" w:hAnsi="Arial"/>
           <w:b w:val="0"/>
           <w:i w:val="0"/>
+          <w:color w:val="000000"/>
           <w:sz w:val="22"/>
         </w:rPr>
         <w:t>Para este análisis parto de un universo de gasto anual estimado de $40.000 millones COP en compras y contratación de proyectos (cifra de trabajo con fines académicos). Aplico los pasos del módulo: cubo del gasto, Pareto, identificación de categorías estratégicas y gasto impactado.</w:t>
@@ -1527,8 +1665,8 @@
           <w:rFonts w:ascii="Arial" w:hAnsi="Arial"/>
           <w:b/>
           <w:i w:val="0"/>
-          <w:color w:val="0B6E4F"/>
-          <w:sz w:val="23"/>
+          <w:color w:val="000000"/>
+          <w:sz w:val="22"/>
         </w:rPr>
         <w:t>Ejemplo de cubo del gasto</w:t>
       </w:r>
@@ -1542,9 +1680,41 @@
           <w:rFonts w:ascii="Arial" w:hAnsi="Arial"/>
           <w:b w:val="0"/>
           <w:i w:val="0"/>
+          <w:color w:val="000000"/>
           <w:sz w:val="22"/>
         </w:rPr>
-        <w:t>El cubo del gasto permite cruzar varias dimensiones a la vez: qué se compra, a quién, quién lo consume, cómo se compra y cuándo. A continuación muestro un fragmento a modo de ejemplo:</w:t>
+        <w:t>El cubo del gasto permite cruzar varias dimensiones a la vez: qué se compra, a quién, quién lo consume, cómo se compra y cuándo. La Tabla 3 muestra un fragmento a modo de ejemplo.</w:t>
+      </w:r>
+    </w:p>
+    <w:p>
+      <w:pPr>
+        <w:spacing w:before="120" w:after="0"/>
+      </w:pPr>
+      <w:r>
+        <w:rPr>
+          <w:rFonts w:ascii="Arial" w:hAnsi="Arial"/>
+          <w:b/>
+          <w:i w:val="0"/>
+          <w:color w:val="000000"/>
+          <w:sz w:val="20"/>
+        </w:rPr>
+        <w:t>Tabla 3</w:t>
+      </w:r>
+    </w:p>
+    <w:p>
+      <w:pPr>
+        <w:spacing w:after="160"/>
+        <w:jc w:val="left"/>
+      </w:pPr>
+      <w:r>
+        <w:rPr>
+          <w:rFonts w:ascii="Arial" w:hAnsi="Arial"/>
+          <w:b w:val="0"/>
+          <w:i/>
+          <w:color w:val="000000"/>
+          <w:sz w:val="18"/>
+        </w:rPr>
+        <w:t>Fragmento ilustrativo del cubo del gasto de Evolti (cinco dimensiones y valor)</w:t>
       </w:r>
     </w:p>
     <w:tbl>
@@ -1555,18 +1725,18 @@
         <w:tblLook w:firstColumn="1" w:firstRow="1" w:lastColumn="0" w:lastRow="0" w:noHBand="0" w:noVBand="1" w:val="04A0"/>
       </w:tblPr>
       <w:tblGrid>
-        <w:gridCol w:w="1473"/>
-        <w:gridCol w:w="1473"/>
-        <w:gridCol w:w="1473"/>
-        <w:gridCol w:w="1473"/>
-        <w:gridCol w:w="1473"/>
-        <w:gridCol w:w="1473"/>
+        <w:gridCol w:w="1560"/>
+        <w:gridCol w:w="1560"/>
+        <w:gridCol w:w="1560"/>
+        <w:gridCol w:w="1560"/>
+        <w:gridCol w:w="1560"/>
+        <w:gridCol w:w="1560"/>
       </w:tblGrid>
       <w:tr>
         <w:tc>
           <w:tcPr>
             <w:tcW w:type="dxa" w:w="2160"/>
-            <w:shd w:val="clear" w:color="auto" w:fill="1F3864"/>
+            <w:shd w:val="clear" w:color="auto" w:fill="D9D9D9"/>
           </w:tcPr>
           <w:p>
             <w:r/>
@@ -1575,7 +1745,7 @@
                 <w:rFonts w:ascii="Arial" w:hAnsi="Arial"/>
                 <w:b/>
                 <w:i w:val="0"/>
-                <w:color w:val="FFFFFF"/>
+                <w:color w:val="000000"/>
                 <w:sz w:val="17"/>
               </w:rPr>
               <w:t>Categoría (árbol)</w:t>
@@ -1585,7 +1755,7 @@
         <w:tc>
           <w:tcPr>
             <w:tcW w:type="dxa" w:w="1728"/>
-            <w:shd w:val="clear" w:color="auto" w:fill="1F3864"/>
+            <w:shd w:val="clear" w:color="auto" w:fill="D9D9D9"/>
           </w:tcPr>
           <w:p>
             <w:r/>
@@ -1594,7 +1764,7 @@
                 <w:rFonts w:ascii="Arial" w:hAnsi="Arial"/>
                 <w:b/>
                 <w:i w:val="0"/>
-                <w:color w:val="FFFFFF"/>
+                <w:color w:val="000000"/>
                 <w:sz w:val="17"/>
               </w:rPr>
               <w:t>Proveedor</w:t>
@@ -1604,7 +1774,7 @@
         <w:tc>
           <w:tcPr>
             <w:tcW w:type="dxa" w:w="1728"/>
-            <w:shd w:val="clear" w:color="auto" w:fill="1F3864"/>
+            <w:shd w:val="clear" w:color="auto" w:fill="D9D9D9"/>
           </w:tcPr>
           <w:p>
             <w:r/>
@@ -1613,7 +1783,7 @@
                 <w:rFonts w:ascii="Arial" w:hAnsi="Arial"/>
                 <w:b/>
                 <w:i w:val="0"/>
-                <w:color w:val="FFFFFF"/>
+                <w:color w:val="000000"/>
                 <w:sz w:val="17"/>
               </w:rPr>
               <w:t>Proyecto/Centro</w:t>
@@ -1623,7 +1793,7 @@
         <w:tc>
           <w:tcPr>
             <w:tcW w:type="dxa" w:w="1872"/>
-            <w:shd w:val="clear" w:color="auto" w:fill="1F3864"/>
+            <w:shd w:val="clear" w:color="auto" w:fill="D9D9D9"/>
           </w:tcPr>
           <w:p>
             <w:r/>
@@ -1632,7 +1802,7 @@
                 <w:rFonts w:ascii="Arial" w:hAnsi="Arial"/>
                 <w:b/>
                 <w:i w:val="0"/>
-                <w:color w:val="FFFFFF"/>
+                <w:color w:val="000000"/>
                 <w:sz w:val="17"/>
               </w:rPr>
               <w:t>Modalidad</w:t>
@@ -1642,7 +1812,7 @@
         <w:tc>
           <w:tcPr>
             <w:tcW w:type="dxa" w:w="720"/>
-            <w:shd w:val="clear" w:color="auto" w:fill="1F3864"/>
+            <w:shd w:val="clear" w:color="auto" w:fill="D9D9D9"/>
           </w:tcPr>
           <w:p>
             <w:r/>
@@ -1651,7 +1821,7 @@
                 <w:rFonts w:ascii="Arial" w:hAnsi="Arial"/>
                 <w:b/>
                 <w:i w:val="0"/>
-                <w:color w:val="FFFFFF"/>
+                <w:color w:val="000000"/>
                 <w:sz w:val="17"/>
               </w:rPr>
               <w:t>Mes</w:t>
@@ -1661,7 +1831,7 @@
         <w:tc>
           <w:tcPr>
             <w:tcW w:type="dxa" w:w="1440"/>
-            <w:shd w:val="clear" w:color="auto" w:fill="1F3864"/>
+            <w:shd w:val="clear" w:color="auto" w:fill="D9D9D9"/>
           </w:tcPr>
           <w:p>
             <w:r/>
@@ -1670,7 +1840,7 @@
                 <w:rFonts w:ascii="Arial" w:hAnsi="Arial"/>
                 <w:b/>
                 <w:i w:val="0"/>
-                <w:color w:val="FFFFFF"/>
+                <w:color w:val="000000"/>
                 <w:sz w:val="17"/>
               </w:rPr>
               <w:t>Valor (MM COP)</w:t>
@@ -1690,6 +1860,7 @@
                 <w:rFonts w:ascii="Arial" w:hAnsi="Arial"/>
                 <w:b w:val="0"/>
                 <w:i w:val="0"/>
+                <w:color w:val="000000"/>
                 <w:sz w:val="17"/>
               </w:rPr>
               <w:t>1.1 Paneles solares</w:t>
@@ -1707,6 +1878,7 @@
                 <w:rFonts w:ascii="Arial" w:hAnsi="Arial"/>
                 <w:b w:val="0"/>
                 <w:i w:val="0"/>
+                <w:color w:val="000000"/>
                 <w:sz w:val="17"/>
               </w:rPr>
               <w:t>SolarPro Int.</w:t>
@@ -1724,6 +1896,7 @@
                 <w:rFonts w:ascii="Arial" w:hAnsi="Arial"/>
                 <w:b w:val="0"/>
                 <w:i w:val="0"/>
+                <w:color w:val="000000"/>
                 <w:sz w:val="17"/>
               </w:rPr>
               <w:t>Granja Norte</w:t>
@@ -1741,6 +1914,7 @@
                 <w:rFonts w:ascii="Arial" w:hAnsi="Arial"/>
                 <w:b w:val="0"/>
                 <w:i w:val="0"/>
+                <w:color w:val="000000"/>
                 <w:sz w:val="17"/>
               </w:rPr>
               <w:t>Contrato marco</w:t>
@@ -1758,6 +1932,7 @@
                 <w:rFonts w:ascii="Arial" w:hAnsi="Arial"/>
                 <w:b w:val="0"/>
                 <w:i w:val="0"/>
+                <w:color w:val="000000"/>
                 <w:sz w:val="17"/>
               </w:rPr>
               <w:t>Feb</w:t>
@@ -1775,6 +1950,7 @@
                 <w:rFonts w:ascii="Arial" w:hAnsi="Arial"/>
                 <w:b w:val="0"/>
                 <w:i w:val="0"/>
+                <w:color w:val="000000"/>
                 <w:sz w:val="17"/>
               </w:rPr>
               <w:t>9.800</w:t>
@@ -1794,6 +1970,7 @@
                 <w:rFonts w:ascii="Arial" w:hAnsi="Arial"/>
                 <w:b w:val="0"/>
                 <w:i w:val="0"/>
+                <w:color w:val="000000"/>
                 <w:sz w:val="17"/>
               </w:rPr>
               <w:t>1.2 Inversores</w:t>
@@ -1811,6 +1988,7 @@
                 <w:rFonts w:ascii="Arial" w:hAnsi="Arial"/>
                 <w:b w:val="0"/>
                 <w:i w:val="0"/>
+                <w:color w:val="000000"/>
                 <w:sz w:val="17"/>
               </w:rPr>
               <w:t>PowerConv SAS</w:t>
@@ -1828,6 +2006,7 @@
                 <w:rFonts w:ascii="Arial" w:hAnsi="Arial"/>
                 <w:b w:val="0"/>
                 <w:i w:val="0"/>
+                <w:color w:val="000000"/>
                 <w:sz w:val="17"/>
               </w:rPr>
               <w:t>Granja Norte</w:t>
@@ -1845,6 +2024,7 @@
                 <w:rFonts w:ascii="Arial" w:hAnsi="Arial"/>
                 <w:b w:val="0"/>
                 <w:i w:val="0"/>
+                <w:color w:val="000000"/>
                 <w:sz w:val="17"/>
               </w:rPr>
               <w:t>Orden de compra</w:t>
@@ -1862,6 +2042,7 @@
                 <w:rFonts w:ascii="Arial" w:hAnsi="Arial"/>
                 <w:b w:val="0"/>
                 <w:i w:val="0"/>
+                <w:color w:val="000000"/>
                 <w:sz w:val="17"/>
               </w:rPr>
               <w:t>Mar</w:t>
@@ -1879,6 +2060,7 @@
                 <w:rFonts w:ascii="Arial" w:hAnsi="Arial"/>
                 <w:b w:val="0"/>
                 <w:i w:val="0"/>
+                <w:color w:val="000000"/>
                 <w:sz w:val="17"/>
               </w:rPr>
               <w:t>4.200</w:t>
@@ -1898,6 +2080,7 @@
                 <w:rFonts w:ascii="Arial" w:hAnsi="Arial"/>
                 <w:b w:val="0"/>
                 <w:i w:val="0"/>
+                <w:color w:val="000000"/>
                 <w:sz w:val="17"/>
               </w:rPr>
               <w:t>2.1 Estructura soporte</w:t>
@@ -1915,6 +2098,7 @@
                 <w:rFonts w:ascii="Arial" w:hAnsi="Arial"/>
                 <w:b w:val="0"/>
                 <w:i w:val="0"/>
+                <w:color w:val="000000"/>
                 <w:sz w:val="17"/>
               </w:rPr>
               <w:t>MetalMonta</w:t>
@@ -1932,6 +2116,7 @@
                 <w:rFonts w:ascii="Arial" w:hAnsi="Arial"/>
                 <w:b w:val="0"/>
                 <w:i w:val="0"/>
+                <w:color w:val="000000"/>
                 <w:sz w:val="17"/>
               </w:rPr>
               <w:t>Granja Sur</w:t>
@@ -1949,6 +2134,7 @@
                 <w:rFonts w:ascii="Arial" w:hAnsi="Arial"/>
                 <w:b w:val="0"/>
                 <w:i w:val="0"/>
+                <w:color w:val="000000"/>
                 <w:sz w:val="17"/>
               </w:rPr>
               <w:t>Contrato</w:t>
@@ -1966,6 +2152,7 @@
                 <w:rFonts w:ascii="Arial" w:hAnsi="Arial"/>
                 <w:b w:val="0"/>
                 <w:i w:val="0"/>
+                <w:color w:val="000000"/>
                 <w:sz w:val="17"/>
               </w:rPr>
               <w:t>Abr</w:t>
@@ -1983,6 +2170,7 @@
                 <w:rFonts w:ascii="Arial" w:hAnsi="Arial"/>
                 <w:b w:val="0"/>
                 <w:i w:val="0"/>
+                <w:color w:val="000000"/>
                 <w:sz w:val="17"/>
               </w:rPr>
               <w:t>3.500</w:t>
@@ -2002,6 +2190,7 @@
                 <w:rFonts w:ascii="Arial" w:hAnsi="Arial"/>
                 <w:b w:val="0"/>
                 <w:i w:val="0"/>
+                <w:color w:val="000000"/>
                 <w:sz w:val="17"/>
               </w:rPr>
               <w:t>3.2 Transformadores</w:t>
@@ -2019,6 +2208,7 @@
                 <w:rFonts w:ascii="Arial" w:hAnsi="Arial"/>
                 <w:b w:val="0"/>
                 <w:i w:val="0"/>
+                <w:color w:val="000000"/>
                 <w:sz w:val="17"/>
               </w:rPr>
               <w:t>ElectroAndina</w:t>
@@ -2036,6 +2226,7 @@
                 <w:rFonts w:ascii="Arial" w:hAnsi="Arial"/>
                 <w:b w:val="0"/>
                 <w:i w:val="0"/>
+                <w:color w:val="000000"/>
                 <w:sz w:val="17"/>
               </w:rPr>
               <w:t>Granja Sur</w:t>
@@ -2053,6 +2244,7 @@
                 <w:rFonts w:ascii="Arial" w:hAnsi="Arial"/>
                 <w:b w:val="0"/>
                 <w:i w:val="0"/>
+                <w:color w:val="000000"/>
                 <w:sz w:val="17"/>
               </w:rPr>
               <w:t>Orden de compra</w:t>
@@ -2070,6 +2262,7 @@
                 <w:rFonts w:ascii="Arial" w:hAnsi="Arial"/>
                 <w:b w:val="0"/>
                 <w:i w:val="0"/>
+                <w:color w:val="000000"/>
                 <w:sz w:val="17"/>
               </w:rPr>
               <w:t>May</w:t>
@@ -2087,6 +2280,7 @@
                 <w:rFonts w:ascii="Arial" w:hAnsi="Arial"/>
                 <w:b w:val="0"/>
                 <w:i w:val="0"/>
+                <w:color w:val="000000"/>
                 <w:sz w:val="17"/>
               </w:rPr>
               <w:t>2.100</w:t>
@@ -2106,6 +2300,7 @@
                 <w:rFonts w:ascii="Arial" w:hAnsi="Arial"/>
                 <w:b w:val="0"/>
                 <w:i w:val="0"/>
+                <w:color w:val="000000"/>
                 <w:sz w:val="17"/>
               </w:rPr>
               <w:t>4.1 Obra civil</w:t>
@@ -2123,6 +2318,7 @@
                 <w:rFonts w:ascii="Arial" w:hAnsi="Arial"/>
                 <w:b w:val="0"/>
                 <w:i w:val="0"/>
+                <w:color w:val="000000"/>
                 <w:sz w:val="17"/>
               </w:rPr>
               <w:t>Construcaribe</w:t>
@@ -2140,6 +2336,7 @@
                 <w:rFonts w:ascii="Arial" w:hAnsi="Arial"/>
                 <w:b w:val="0"/>
                 <w:i w:val="0"/>
+                <w:color w:val="000000"/>
                 <w:sz w:val="17"/>
               </w:rPr>
               <w:t>Granja Norte</w:t>
@@ -2157,6 +2354,7 @@
                 <w:rFonts w:ascii="Arial" w:hAnsi="Arial"/>
                 <w:b w:val="0"/>
                 <w:i w:val="0"/>
+                <w:color w:val="000000"/>
                 <w:sz w:val="17"/>
               </w:rPr>
               <w:t>Subcontrato</w:t>
@@ -2174,6 +2372,7 @@
                 <w:rFonts w:ascii="Arial" w:hAnsi="Arial"/>
                 <w:b w:val="0"/>
                 <w:i w:val="0"/>
+                <w:color w:val="000000"/>
                 <w:sz w:val="17"/>
               </w:rPr>
               <w:t>Jun</w:t>
@@ -2191,6 +2390,7 @@
                 <w:rFonts w:ascii="Arial" w:hAnsi="Arial"/>
                 <w:b w:val="0"/>
                 <w:i w:val="0"/>
+                <w:color w:val="000000"/>
                 <w:sz w:val="17"/>
               </w:rPr>
               <w:t>3.000</w:t>
@@ -2214,10 +2414,10 @@
           <w:rFonts w:ascii="Arial" w:hAnsi="Arial"/>
           <w:b w:val="0"/>
           <w:i/>
-          <w:color w:val="444444"/>
-          <w:sz w:val="17"/>
+          <w:color w:val="000000"/>
+          <w:sz w:val="18"/>
         </w:rPr>
-        <w:t>Tabla 3. Fragmento ilustrativo del cubo del gasto de Evolti (5 dimensiones + valor).</w:t>
+        <w:t>Nota. Datos ilustrativos con fines académicos.</w:t>
       </w:r>
     </w:p>
     <w:p>
@@ -2230,8 +2430,8 @@
           <w:rFonts w:ascii="Arial" w:hAnsi="Arial"/>
           <w:b/>
           <w:i w:val="0"/>
-          <w:color w:val="0B6E4F"/>
-          <w:sz w:val="23"/>
+          <w:color w:val="000000"/>
+          <w:sz w:val="22"/>
         </w:rPr>
         <w:t>Análisis Pareto (80/20)</w:t>
       </w:r>
@@ -2245,9 +2445,41 @@
           <w:rFonts w:ascii="Arial" w:hAnsi="Arial"/>
           <w:b w:val="0"/>
           <w:i w:val="0"/>
+          <w:color w:val="000000"/>
           <w:sz w:val="22"/>
         </w:rPr>
-        <w:t>Al agrupar el gasto por categoría y ordenarlo de mayor a menor, aplico el principio de Pareto para identificar las pocas categorías que concentran la mayor parte del gasto:</w:t>
+        <w:t>Al agrupar el gasto por categoría y ordenarlo de mayor a menor, aplico el principio de Pareto para identificar las pocas categorías que concentran la mayor parte del gasto (ver Tabla 4).</w:t>
+      </w:r>
+    </w:p>
+    <w:p>
+      <w:pPr>
+        <w:spacing w:before="120" w:after="0"/>
+      </w:pPr>
+      <w:r>
+        <w:rPr>
+          <w:rFonts w:ascii="Arial" w:hAnsi="Arial"/>
+          <w:b/>
+          <w:i w:val="0"/>
+          <w:color w:val="000000"/>
+          <w:sz w:val="20"/>
+        </w:rPr>
+        <w:t>Tabla 4</w:t>
+      </w:r>
+    </w:p>
+    <w:p>
+      <w:pPr>
+        <w:spacing w:after="160"/>
+        <w:jc w:val="left"/>
+      </w:pPr>
+      <w:r>
+        <w:rPr>
+          <w:rFonts w:ascii="Arial" w:hAnsi="Arial"/>
+          <w:b w:val="0"/>
+          <w:i/>
+          <w:color w:val="000000"/>
+          <w:sz w:val="18"/>
+        </w:rPr>
+        <w:t>Análisis de Pareto del gasto anual estimado de Evolti</w:t>
       </w:r>
     </w:p>
     <w:tbl>
@@ -2258,16 +2490,16 @@
         <w:tblLook w:firstColumn="1" w:firstRow="1" w:lastColumn="0" w:lastRow="0" w:noHBand="0" w:noVBand="1" w:val="04A0"/>
       </w:tblPr>
       <w:tblGrid>
-        <w:gridCol w:w="2209"/>
-        <w:gridCol w:w="2209"/>
-        <w:gridCol w:w="2209"/>
-        <w:gridCol w:w="2209"/>
+        <w:gridCol w:w="2340"/>
+        <w:gridCol w:w="2340"/>
+        <w:gridCol w:w="2340"/>
+        <w:gridCol w:w="2340"/>
       </w:tblGrid>
       <w:tr>
         <w:tc>
           <w:tcPr>
             <w:tcW w:type="dxa" w:w="3456"/>
-            <w:shd w:val="clear" w:color="auto" w:fill="1F3864"/>
+            <w:shd w:val="clear" w:color="auto" w:fill="D9D9D9"/>
           </w:tcPr>
           <w:p>
             <w:r/>
@@ -2276,7 +2508,7 @@
                 <w:rFonts w:ascii="Arial" w:hAnsi="Arial"/>
                 <w:b/>
                 <w:i w:val="0"/>
-                <w:color w:val="FFFFFF"/>
+                <w:color w:val="000000"/>
                 <w:sz w:val="18"/>
               </w:rPr>
               <w:t>Categoría</w:t>
@@ -2286,7 +2518,7 @@
         <w:tc>
           <w:tcPr>
             <w:tcW w:type="dxa" w:w="1872"/>
-            <w:shd w:val="clear" w:color="auto" w:fill="1F3864"/>
+            <w:shd w:val="clear" w:color="auto" w:fill="D9D9D9"/>
           </w:tcPr>
           <w:p>
             <w:r/>
@@ -2295,7 +2527,7 @@
                 <w:rFonts w:ascii="Arial" w:hAnsi="Arial"/>
                 <w:b/>
                 <w:i w:val="0"/>
-                <w:color w:val="FFFFFF"/>
+                <w:color w:val="000000"/>
                 <w:sz w:val="18"/>
               </w:rPr>
               <w:t>Gasto (MM COP)</w:t>
@@ -2305,7 +2537,7 @@
         <w:tc>
           <w:tcPr>
             <w:tcW w:type="dxa" w:w="1440"/>
-            <w:shd w:val="clear" w:color="auto" w:fill="1F3864"/>
+            <w:shd w:val="clear" w:color="auto" w:fill="D9D9D9"/>
           </w:tcPr>
           <w:p>
             <w:r/>
@@ -2314,7 +2546,7 @@
                 <w:rFonts w:ascii="Arial" w:hAnsi="Arial"/>
                 <w:b/>
                 <w:i w:val="0"/>
-                <w:color w:val="FFFFFF"/>
+                <w:color w:val="000000"/>
                 <w:sz w:val="18"/>
               </w:rPr>
               <w:t>% del total</w:t>
@@ -2324,7 +2556,7 @@
         <w:tc>
           <w:tcPr>
             <w:tcW w:type="dxa" w:w="1584"/>
-            <w:shd w:val="clear" w:color="auto" w:fill="1F3864"/>
+            <w:shd w:val="clear" w:color="auto" w:fill="D9D9D9"/>
           </w:tcPr>
           <w:p>
             <w:r/>
@@ -2333,7 +2565,7 @@
                 <w:rFonts w:ascii="Arial" w:hAnsi="Arial"/>
                 <w:b/>
                 <w:i w:val="0"/>
-                <w:color w:val="FFFFFF"/>
+                <w:color w:val="000000"/>
                 <w:sz w:val="18"/>
               </w:rPr>
               <w:t>% acumulado</w:t>
@@ -2353,6 +2585,7 @@
                 <w:rFonts w:ascii="Arial" w:hAnsi="Arial"/>
                 <w:b w:val="0"/>
                 <w:i w:val="0"/>
+                <w:color w:val="000000"/>
                 <w:sz w:val="18"/>
               </w:rPr>
               <w:t>1. Componentes fotovoltaicos</w:t>
@@ -2370,6 +2603,7 @@
                 <w:rFonts w:ascii="Arial" w:hAnsi="Arial"/>
                 <w:b w:val="0"/>
                 <w:i w:val="0"/>
+                <w:color w:val="000000"/>
                 <w:sz w:val="18"/>
               </w:rPr>
               <w:t>18.000</w:t>
@@ -2387,6 +2621,7 @@
                 <w:rFonts w:ascii="Arial" w:hAnsi="Arial"/>
                 <w:b w:val="0"/>
                 <w:i w:val="0"/>
+                <w:color w:val="000000"/>
                 <w:sz w:val="18"/>
               </w:rPr>
               <w:t>45 %</w:t>
@@ -2404,6 +2639,7 @@
                 <w:rFonts w:ascii="Arial" w:hAnsi="Arial"/>
                 <w:b w:val="0"/>
                 <w:i w:val="0"/>
+                <w:color w:val="000000"/>
                 <w:sz w:val="18"/>
               </w:rPr>
               <w:t>45 %</w:t>
@@ -2423,6 +2659,7 @@
                 <w:rFonts w:ascii="Arial" w:hAnsi="Arial"/>
                 <w:b w:val="0"/>
                 <w:i w:val="0"/>
+                <w:color w:val="000000"/>
                 <w:sz w:val="18"/>
               </w:rPr>
               <w:t>2. Estructuras y montaje</w:t>
@@ -2440,6 +2677,7 @@
                 <w:rFonts w:ascii="Arial" w:hAnsi="Arial"/>
                 <w:b w:val="0"/>
                 <w:i w:val="0"/>
+                <w:color w:val="000000"/>
                 <w:sz w:val="18"/>
               </w:rPr>
               <w:t>8.000</w:t>
@@ -2457,6 +2695,7 @@
                 <w:rFonts w:ascii="Arial" w:hAnsi="Arial"/>
                 <w:b w:val="0"/>
                 <w:i w:val="0"/>
+                <w:color w:val="000000"/>
                 <w:sz w:val="18"/>
               </w:rPr>
               <w:t>20 %</w:t>
@@ -2474,6 +2713,7 @@
                 <w:rFonts w:ascii="Arial" w:hAnsi="Arial"/>
                 <w:b w:val="0"/>
                 <w:i w:val="0"/>
+                <w:color w:val="000000"/>
                 <w:sz w:val="18"/>
               </w:rPr>
               <w:t>65 %</w:t>
@@ -2493,6 +2733,7 @@
                 <w:rFonts w:ascii="Arial" w:hAnsi="Arial"/>
                 <w:b w:val="0"/>
                 <w:i w:val="0"/>
+                <w:color w:val="000000"/>
                 <w:sz w:val="18"/>
               </w:rPr>
               <w:t>3. Materiales eléctricos (BOS)</w:t>
@@ -2510,6 +2751,7 @@
                 <w:rFonts w:ascii="Arial" w:hAnsi="Arial"/>
                 <w:b w:val="0"/>
                 <w:i w:val="0"/>
+                <w:color w:val="000000"/>
                 <w:sz w:val="18"/>
               </w:rPr>
               <w:t>6.000</w:t>
@@ -2527,6 +2769,7 @@
                 <w:rFonts w:ascii="Arial" w:hAnsi="Arial"/>
                 <w:b w:val="0"/>
                 <w:i w:val="0"/>
+                <w:color w:val="000000"/>
                 <w:sz w:val="18"/>
               </w:rPr>
               <w:t>15 %</w:t>
@@ -2544,6 +2787,7 @@
                 <w:rFonts w:ascii="Arial" w:hAnsi="Arial"/>
                 <w:b w:val="0"/>
                 <w:i w:val="0"/>
+                <w:color w:val="000000"/>
                 <w:sz w:val="18"/>
               </w:rPr>
               <w:t>80 %</w:t>
@@ -2563,6 +2807,7 @@
                 <w:rFonts w:ascii="Arial" w:hAnsi="Arial"/>
                 <w:b w:val="0"/>
                 <w:i w:val="0"/>
+                <w:color w:val="000000"/>
                 <w:sz w:val="18"/>
               </w:rPr>
               <w:t>4. Obra civil y servicios</w:t>
@@ -2580,6 +2825,7 @@
                 <w:rFonts w:ascii="Arial" w:hAnsi="Arial"/>
                 <w:b w:val="0"/>
                 <w:i w:val="0"/>
+                <w:color w:val="000000"/>
                 <w:sz w:val="18"/>
               </w:rPr>
               <w:t>5.200</w:t>
@@ -2597,6 +2843,7 @@
                 <w:rFonts w:ascii="Arial" w:hAnsi="Arial"/>
                 <w:b w:val="0"/>
                 <w:i w:val="0"/>
+                <w:color w:val="000000"/>
                 <w:sz w:val="18"/>
               </w:rPr>
               <w:t>13 %</w:t>
@@ -2614,6 +2861,7 @@
                 <w:rFonts w:ascii="Arial" w:hAnsi="Arial"/>
                 <w:b w:val="0"/>
                 <w:i w:val="0"/>
+                <w:color w:val="000000"/>
                 <w:sz w:val="18"/>
               </w:rPr>
               <w:t>93 %</w:t>
@@ -2633,6 +2881,7 @@
                 <w:rFonts w:ascii="Arial" w:hAnsi="Arial"/>
                 <w:b w:val="0"/>
                 <w:i w:val="0"/>
+                <w:color w:val="000000"/>
                 <w:sz w:val="18"/>
               </w:rPr>
               <w:t>Otras compras menores</w:t>
@@ -2650,6 +2899,7 @@
                 <w:rFonts w:ascii="Arial" w:hAnsi="Arial"/>
                 <w:b w:val="0"/>
                 <w:i w:val="0"/>
+                <w:color w:val="000000"/>
                 <w:sz w:val="18"/>
               </w:rPr>
               <w:t>2.800</w:t>
@@ -2667,6 +2917,7 @@
                 <w:rFonts w:ascii="Arial" w:hAnsi="Arial"/>
                 <w:b w:val="0"/>
                 <w:i w:val="0"/>
+                <w:color w:val="000000"/>
                 <w:sz w:val="18"/>
               </w:rPr>
               <w:t>7 %</w:t>
@@ -2684,6 +2935,7 @@
                 <w:rFonts w:ascii="Arial" w:hAnsi="Arial"/>
                 <w:b w:val="0"/>
                 <w:i w:val="0"/>
+                <w:color w:val="000000"/>
                 <w:sz w:val="18"/>
               </w:rPr>
               <w:t>100 %</w:t>
@@ -2703,6 +2955,7 @@
                 <w:rFonts w:ascii="Arial" w:hAnsi="Arial"/>
                 <w:b w:val="0"/>
                 <w:i w:val="0"/>
+                <w:color w:val="000000"/>
                 <w:sz w:val="18"/>
               </w:rPr>
               <w:t>Total</w:t>
@@ -2720,6 +2973,7 @@
                 <w:rFonts w:ascii="Arial" w:hAnsi="Arial"/>
                 <w:b w:val="0"/>
                 <w:i w:val="0"/>
+                <w:color w:val="000000"/>
                 <w:sz w:val="18"/>
               </w:rPr>
               <w:t>40.000</w:t>
@@ -2737,6 +2991,7 @@
                 <w:rFonts w:ascii="Arial" w:hAnsi="Arial"/>
                 <w:b w:val="0"/>
                 <w:i w:val="0"/>
+                <w:color w:val="000000"/>
                 <w:sz w:val="18"/>
               </w:rPr>
               <w:t>100 %</w:t>
@@ -2754,6 +3009,7 @@
                 <w:rFonts w:ascii="Arial" w:hAnsi="Arial"/>
                 <w:b w:val="0"/>
                 <w:i w:val="0"/>
+                <w:color w:val="000000"/>
                 <w:sz w:val="18"/>
               </w:rPr>
             </w:r>
@@ -2776,10 +3032,10 @@
           <w:rFonts w:ascii="Arial" w:hAnsi="Arial"/>
           <w:b w:val="0"/>
           <w:i/>
-          <w:color w:val="444444"/>
-          <w:sz w:val="17"/>
+          <w:color w:val="000000"/>
+          <w:sz w:val="18"/>
         </w:rPr>
-        <w:t>Tabla 4. Análisis de Pareto del gasto anual estimado de Evolti.</w:t>
+        <w:t>Nota. Datos ilustrativos con fines académicos.</w:t>
       </w:r>
     </w:p>
     <w:p>
@@ -2791,6 +3047,7 @@
           <w:rFonts w:ascii="Arial" w:hAnsi="Arial"/>
           <w:b w:val="0"/>
           <w:i w:val="0"/>
+          <w:color w:val="000000"/>
           <w:sz w:val="22"/>
         </w:rPr>
         <w:t>Hallazgo Pareto: las dos primeras categorías (componentes fotovoltaicos y estructuras) concentran el 65 % del gasto, y las tres primeras llegan al 80 %. Esto indica que el foco estratégico inicial debe ir a esas categorías, porque es donde una mejora en la compra genera el mayor impacto, y porque el equipo de compras tiene capacidad limitada y no puede atacar todo al mismo tiempo.</w:t>
@@ -2806,8 +3063,8 @@
           <w:rFonts w:ascii="Arial" w:hAnsi="Arial"/>
           <w:b/>
           <w:i w:val="0"/>
-          <w:color w:val="0B6E4F"/>
-          <w:sz w:val="23"/>
+          <w:color w:val="000000"/>
+          <w:sz w:val="22"/>
         </w:rPr>
         <w:t>Identificación de categorías estratégicas</w:t>
       </w:r>
@@ -2821,6 +3078,7 @@
           <w:rFonts w:ascii="Arial" w:hAnsi="Arial"/>
           <w:b w:val="0"/>
           <w:i w:val="0"/>
+          <w:color w:val="000000"/>
           <w:sz w:val="22"/>
         </w:rPr>
         <w:t>Con base en el Pareto, considero estratégicas a las categorías 1 (componentes fotovoltaicos) y 2 (estructuras y montaje): son las de mayor gasto y, además, las de mayor riesgo de suministro, porque dependen de proveedores internacionales y su retraso frena toda la obra. La categoría 3 (eléctricos) es importante por su peso, pero tiene más proveedores disponibles en el mercado.</w:t>
@@ -2836,8 +3094,8 @@
           <w:rFonts w:ascii="Arial" w:hAnsi="Arial"/>
           <w:b/>
           <w:i w:val="0"/>
-          <w:color w:val="0B6E4F"/>
-          <w:sz w:val="23"/>
+          <w:color w:val="000000"/>
+          <w:sz w:val="22"/>
         </w:rPr>
         <w:t>Identificación de gasto impactado</w:t>
       </w:r>
@@ -2851,6 +3109,7 @@
           <w:rFonts w:ascii="Arial" w:hAnsi="Arial"/>
           <w:b w:val="0"/>
           <w:i w:val="0"/>
+          <w:color w:val="000000"/>
           <w:sz w:val="22"/>
         </w:rPr>
         <w:t>Un aprendizaje clave del módulo es no prometer ahorros sobre todo el gasto de una categoría, sino solo sobre el “gasto impactado”, que es la parte que una iniciativa realmente puede intervenir. Lo aplico a los inversores (subcategoría 1.2):</w:t>
@@ -2866,6 +3125,7 @@
           <w:rFonts w:ascii="Arial" w:hAnsi="Arial"/>
           <w:b w:val="0"/>
           <w:i w:val="0"/>
+          <w:color w:val="000000"/>
           <w:sz w:val="22"/>
         </w:rPr>
         <w:t>Gasto total de la categoría 1 (fotovoltaicos): $18.000 MM.</w:t>
@@ -2881,6 +3141,7 @@
           <w:rFonts w:ascii="Arial" w:hAnsi="Arial"/>
           <w:b w:val="0"/>
           <w:i w:val="0"/>
+          <w:color w:val="000000"/>
           <w:sz w:val="22"/>
         </w:rPr>
         <w:t>Gasto de la subcategoría 1.2 (inversores) donde hay palanca real de negociación: $4.200 MM.</w:t>
@@ -2896,6 +3157,7 @@
           <w:rFonts w:ascii="Arial" w:hAnsi="Arial"/>
           <w:b w:val="0"/>
           <w:i w:val="0"/>
+          <w:color w:val="000000"/>
           <w:sz w:val="22"/>
         </w:rPr>
         <w:t>Meta de ahorro realista mediante contrato marco y estandarización: 8 %.</w:t>
@@ -2911,6 +3173,7 @@
           <w:rFonts w:ascii="Arial" w:hAnsi="Arial"/>
           <w:b w:val="0"/>
           <w:i w:val="0"/>
+          <w:color w:val="000000"/>
           <w:sz w:val="22"/>
         </w:rPr>
         <w:t>Ahorro esperado = $336 MM/año. Gasto objetivo = 4.200 − 336 = $3.864 MM.</w:t>
@@ -2925,6 +3188,7 @@
           <w:rFonts w:ascii="Arial" w:hAnsi="Arial"/>
           <w:b w:val="0"/>
           <w:i w:val="0"/>
+          <w:color w:val="000000"/>
           <w:sz w:val="22"/>
         </w:rPr>
         <w:t>De esta forma el ahorro se calcula sobre lo que de verdad se puede “tocar”, lo que hace la propuesta más creíble y defendible ante la gerencia.</w:t>
@@ -2934,14 +3198,15 @@
       <w:pPr>
         <w:keepNext/>
         <w:spacing w:before="280" w:after="120"/>
+        <w:jc w:val="center"/>
       </w:pPr>
       <w:r>
         <w:rPr>
           <w:rFonts w:ascii="Arial" w:hAnsi="Arial"/>
           <w:b/>
           <w:i w:val="0"/>
-          <w:color w:val="1F3864"/>
-          <w:sz w:val="26"/>
+          <w:color w:val="000000"/>
+          <w:sz w:val="24"/>
         </w:rPr>
         <w:t>5. Aplicación estratégica: Matriz de Kraljic</w:t>
       </w:r>
@@ -2955,9 +3220,41 @@
           <w:rFonts w:ascii="Arial" w:hAnsi="Arial"/>
           <w:b w:val="0"/>
           <w:i w:val="0"/>
+          <w:color w:val="000000"/>
           <w:sz w:val="22"/>
         </w:rPr>
-        <w:t>La Matriz de Kraljic —mencionada en el módulo como un hito de la evolución del procurement— clasifica las categorías según dos ejes: el impacto en el resultado (peso en el gasto/en el negocio) y el riesgo de suministro (qué tan difícil o riesgoso es conseguir el producto). De ese cruce salen cuatro tipos de compras con estrategias diferentes. Ubiqué las categorías de Evolti así:</w:t>
+        <w:t>La Matriz de Kraljic (Kraljic, 1983), mencionada en el módulo como un hito de la evolución del procurement, clasifica las categorías según dos ejes: el impacto en el resultado (peso en el gasto y en el negocio) y el riesgo de suministro (qué tan difícil o riesgoso es conseguir el producto). De ese cruce salen cuatro tipos de compras con estrategias diferentes. Ubiqué las categorías de Evolti como se muestra en la Tabla 5.</w:t>
+      </w:r>
+    </w:p>
+    <w:p>
+      <w:pPr>
+        <w:spacing w:before="120" w:after="0"/>
+      </w:pPr>
+      <w:r>
+        <w:rPr>
+          <w:rFonts w:ascii="Arial" w:hAnsi="Arial"/>
+          <w:b/>
+          <w:i w:val="0"/>
+          <w:color w:val="000000"/>
+          <w:sz w:val="20"/>
+        </w:rPr>
+        <w:t>Tabla 5</w:t>
+      </w:r>
+    </w:p>
+    <w:p>
+      <w:pPr>
+        <w:spacing w:after="160"/>
+        <w:jc w:val="left"/>
+      </w:pPr>
+      <w:r>
+        <w:rPr>
+          <w:rFonts w:ascii="Arial" w:hAnsi="Arial"/>
+          <w:b w:val="0"/>
+          <w:i/>
+          <w:color w:val="000000"/>
+          <w:sz w:val="18"/>
+        </w:rPr>
+        <w:t>Aplicación de la Matriz de Kraljic a las categorías de Evolti</w:t>
       </w:r>
     </w:p>
     <w:tbl>
@@ -2968,16 +3265,16 @@
         <w:tblLook w:firstColumn="1" w:firstRow="1" w:lastColumn="0" w:lastRow="0" w:noHBand="0" w:noVBand="1" w:val="04A0"/>
       </w:tblPr>
       <w:tblGrid>
-        <w:gridCol w:w="2209"/>
-        <w:gridCol w:w="2209"/>
-        <w:gridCol w:w="2209"/>
-        <w:gridCol w:w="2209"/>
+        <w:gridCol w:w="2340"/>
+        <w:gridCol w:w="2340"/>
+        <w:gridCol w:w="2340"/>
+        <w:gridCol w:w="2340"/>
       </w:tblGrid>
       <w:tr>
         <w:tc>
           <w:tcPr>
             <w:tcW w:type="dxa" w:w="1584"/>
-            <w:shd w:val="clear" w:color="auto" w:fill="1F3864"/>
+            <w:shd w:val="clear" w:color="auto" w:fill="D9D9D9"/>
           </w:tcPr>
           <w:p>
             <w:r/>
@@ -2986,7 +3283,7 @@
                 <w:rFonts w:ascii="Arial" w:hAnsi="Arial"/>
                 <w:b/>
                 <w:i w:val="0"/>
-                <w:color w:val="FFFFFF"/>
+                <w:color w:val="000000"/>
                 <w:sz w:val="17"/>
               </w:rPr>
               <w:t>Cuadrante</w:t>
@@ -2996,7 +3293,7 @@
         <w:tc>
           <w:tcPr>
             <w:tcW w:type="dxa" w:w="1872"/>
-            <w:shd w:val="clear" w:color="auto" w:fill="1F3864"/>
+            <w:shd w:val="clear" w:color="auto" w:fill="D9D9D9"/>
           </w:tcPr>
           <w:p>
             <w:r/>
@@ -3005,7 +3302,7 @@
                 <w:rFonts w:ascii="Arial" w:hAnsi="Arial"/>
                 <w:b/>
                 <w:i w:val="0"/>
-                <w:color w:val="FFFFFF"/>
+                <w:color w:val="000000"/>
                 <w:sz w:val="17"/>
               </w:rPr>
               <w:t>Impacto / Riesgo</w:t>
@@ -3015,7 +3312,7 @@
         <w:tc>
           <w:tcPr>
             <w:tcW w:type="dxa" w:w="2160"/>
-            <w:shd w:val="clear" w:color="auto" w:fill="1F3864"/>
+            <w:shd w:val="clear" w:color="auto" w:fill="D9D9D9"/>
           </w:tcPr>
           <w:p>
             <w:r/>
@@ -3024,7 +3321,7 @@
                 <w:rFonts w:ascii="Arial" w:hAnsi="Arial"/>
                 <w:b/>
                 <w:i w:val="0"/>
-                <w:color w:val="FFFFFF"/>
+                <w:color w:val="000000"/>
                 <w:sz w:val="17"/>
               </w:rPr>
               <w:t>Categorías de Evolti</w:t>
@@ -3034,7 +3331,7 @@
         <w:tc>
           <w:tcPr>
             <w:tcW w:type="dxa" w:w="3168"/>
-            <w:shd w:val="clear" w:color="auto" w:fill="1F3864"/>
+            <w:shd w:val="clear" w:color="auto" w:fill="D9D9D9"/>
           </w:tcPr>
           <w:p>
             <w:r/>
@@ -3043,7 +3340,7 @@
                 <w:rFonts w:ascii="Arial" w:hAnsi="Arial"/>
                 <w:b/>
                 <w:i w:val="0"/>
-                <w:color w:val="FFFFFF"/>
+                <w:color w:val="000000"/>
                 <w:sz w:val="17"/>
               </w:rPr>
               <w:t>Estrategia diferenciada</w:t>
@@ -3063,6 +3360,7 @@
                 <w:rFonts w:ascii="Arial" w:hAnsi="Arial"/>
                 <w:b w:val="0"/>
                 <w:i w:val="0"/>
+                <w:color w:val="000000"/>
                 <w:sz w:val="17"/>
               </w:rPr>
               <w:t>Estratégicos</w:t>
@@ -3080,6 +3378,7 @@
                 <w:rFonts w:ascii="Arial" w:hAnsi="Arial"/>
                 <w:b w:val="0"/>
                 <w:i w:val="0"/>
+                <w:color w:val="000000"/>
                 <w:sz w:val="17"/>
               </w:rPr>
               <w:t>Alto impacto / Alto riesgo</w:t>
@@ -3097,6 +3396,7 @@
                 <w:rFonts w:ascii="Arial" w:hAnsi="Arial"/>
                 <w:b w:val="0"/>
                 <w:i w:val="0"/>
+                <w:color w:val="000000"/>
                 <w:sz w:val="17"/>
               </w:rPr>
               <w:t>Paneles solares, inversores</w:t>
@@ -3114,6 +3414,7 @@
                 <w:rFonts w:ascii="Arial" w:hAnsi="Arial"/>
                 <w:b w:val="0"/>
                 <w:i w:val="0"/>
+                <w:color w:val="000000"/>
                 <w:sz w:val="17"/>
               </w:rPr>
               <w:t>Alianzas de largo plazo, contratos marco, dual sourcing, planeación conjunta.</w:t>
@@ -3133,6 +3434,7 @@
                 <w:rFonts w:ascii="Arial" w:hAnsi="Arial"/>
                 <w:b w:val="0"/>
                 <w:i w:val="0"/>
+                <w:color w:val="000000"/>
                 <w:sz w:val="17"/>
               </w:rPr>
               <w:t>Cuello de botella</w:t>
@@ -3150,6 +3452,7 @@
                 <w:rFonts w:ascii="Arial" w:hAnsi="Arial"/>
                 <w:b w:val="0"/>
                 <w:i w:val="0"/>
+                <w:color w:val="000000"/>
                 <w:sz w:val="17"/>
               </w:rPr>
               <w:t>Bajo impacto / Alto riesgo</w:t>
@@ -3167,6 +3470,7 @@
                 <w:rFonts w:ascii="Arial" w:hAnsi="Arial"/>
                 <w:b w:val="0"/>
                 <w:i w:val="0"/>
+                <w:color w:val="000000"/>
                 <w:sz w:val="17"/>
               </w:rPr>
               <w:t>Transformadores, equipos especiales</w:t>
@@ -3184,6 +3488,7 @@
                 <w:rFonts w:ascii="Arial" w:hAnsi="Arial"/>
                 <w:b w:val="0"/>
                 <w:i w:val="0"/>
+                <w:color w:val="000000"/>
                 <w:sz w:val="17"/>
               </w:rPr>
               <w:t>Asegurar stock de seguridad, contratos de continuidad, buscar proveedores alternos.</w:t>
@@ -3203,6 +3508,7 @@
                 <w:rFonts w:ascii="Arial" w:hAnsi="Arial"/>
                 <w:b w:val="0"/>
                 <w:i w:val="0"/>
+                <w:color w:val="000000"/>
                 <w:sz w:val="17"/>
               </w:rPr>
               <w:t>Apalancados</w:t>
@@ -3220,6 +3526,7 @@
                 <w:rFonts w:ascii="Arial" w:hAnsi="Arial"/>
                 <w:b w:val="0"/>
                 <w:i w:val="0"/>
+                <w:color w:val="000000"/>
                 <w:sz w:val="17"/>
               </w:rPr>
               <w:t>Alto impacto / Bajo riesgo</w:t>
@@ -3237,6 +3544,7 @@
                 <w:rFonts w:ascii="Arial" w:hAnsi="Arial"/>
                 <w:b w:val="0"/>
                 <w:i w:val="0"/>
+                <w:color w:val="000000"/>
                 <w:sz w:val="17"/>
               </w:rPr>
               <w:t>Estructuras, cableado, obra civil</w:t>
@@ -3254,6 +3562,7 @@
                 <w:rFonts w:ascii="Arial" w:hAnsi="Arial"/>
                 <w:b w:val="0"/>
                 <w:i w:val="0"/>
+                <w:color w:val="000000"/>
                 <w:sz w:val="17"/>
               </w:rPr>
               <w:t>Negociación por volumen, licitaciones, subastas, consolidar proveedores.</w:t>
@@ -3273,6 +3582,7 @@
                 <w:rFonts w:ascii="Arial" w:hAnsi="Arial"/>
                 <w:b w:val="0"/>
                 <w:i w:val="0"/>
+                <w:color w:val="000000"/>
                 <w:sz w:val="17"/>
               </w:rPr>
               <w:t>Rutinarios</w:t>
@@ -3290,6 +3600,7 @@
                 <w:rFonts w:ascii="Arial" w:hAnsi="Arial"/>
                 <w:b w:val="0"/>
                 <w:i w:val="0"/>
+                <w:color w:val="000000"/>
                 <w:sz w:val="17"/>
               </w:rPr>
               <w:t>Bajo impacto / Bajo riesgo</w:t>
@@ -3307,6 +3618,7 @@
                 <w:rFonts w:ascii="Arial" w:hAnsi="Arial"/>
                 <w:b w:val="0"/>
                 <w:i w:val="0"/>
+                <w:color w:val="000000"/>
                 <w:sz w:val="17"/>
               </w:rPr>
               <w:t>Insumos menores, papelería, EPP</w:t>
@@ -3324,6 +3636,7 @@
                 <w:rFonts w:ascii="Arial" w:hAnsi="Arial"/>
                 <w:b w:val="0"/>
                 <w:i w:val="0"/>
+                <w:color w:val="000000"/>
                 <w:sz w:val="17"/>
               </w:rPr>
               <w:t>Simplificar y automatizar (catálogos, órdenes automáticas), reducir esfuerzo.</w:t>
@@ -3347,10 +3660,10 @@
           <w:rFonts w:ascii="Arial" w:hAnsi="Arial"/>
           <w:b w:val="0"/>
           <w:i/>
-          <w:color w:val="444444"/>
-          <w:sz w:val="17"/>
+          <w:color w:val="000000"/>
+          <w:sz w:val="18"/>
         </w:rPr>
-        <w:t>Tabla 5. Aplicación de la Matriz de Kraljic a las categorías de Evolti.</w:t>
+        <w:t>Nota. Elaboración propia con base en Kraljic (1983).</w:t>
       </w:r>
     </w:p>
     <w:p>
@@ -3363,8 +3676,8 @@
           <w:rFonts w:ascii="Arial" w:hAnsi="Arial"/>
           <w:b/>
           <w:i w:val="0"/>
-          <w:color w:val="0B6E4F"/>
-          <w:sz w:val="23"/>
+          <w:color w:val="000000"/>
+          <w:sz w:val="22"/>
         </w:rPr>
         <w:t>Categorías críticas</w:t>
       </w:r>
@@ -3378,6 +3691,7 @@
           <w:rFonts w:ascii="Arial" w:hAnsi="Arial"/>
           <w:b w:val="0"/>
           <w:i w:val="0"/>
+          <w:color w:val="000000"/>
           <w:sz w:val="22"/>
         </w:rPr>
         <w:t>Las categorías críticas son las del cuadrante estratégico (paneles e inversores) y las de cuello de botella (transformadores y equipos especiales), porque un problema de suministro en cualquiera de ellas detiene el proyecto. Estas son las que más atención, seguimiento y planeación anticipada requieren.</w:t>
@@ -3393,8 +3707,8 @@
           <w:rFonts w:ascii="Arial" w:hAnsi="Arial"/>
           <w:b/>
           <w:i w:val="0"/>
-          <w:color w:val="0B6E4F"/>
-          <w:sz w:val="23"/>
+          <w:color w:val="000000"/>
+          <w:sz w:val="22"/>
         </w:rPr>
         <w:t>Estrategias diferenciadas por categoría</w:t>
       </w:r>
@@ -3409,6 +3723,7 @@
           <w:rFonts w:ascii="Arial" w:hAnsi="Arial"/>
           <w:b w:val="0"/>
           <w:i w:val="0"/>
+          <w:color w:val="000000"/>
           <w:sz w:val="22"/>
         </w:rPr>
         <w:t>Estratégicos (paneles, inversores): construir relaciones de largo plazo con proveedores clave, negociar contratos marco con precios y tiempos asegurados, y evaluar un segundo proveedor (dual sourcing) para no depender de uno solo.</w:t>
@@ -3424,6 +3739,7 @@
           <w:rFonts w:ascii="Arial" w:hAnsi="Arial"/>
           <w:b w:val="0"/>
           <w:i w:val="0"/>
+          <w:color w:val="000000"/>
           <w:sz w:val="22"/>
         </w:rPr>
         <w:t>Cuello de botella (transformadores): mantener inventario de seguridad, anticipar los pedidos y tener proveedores alternos identificados.</w:t>
@@ -3439,6 +3755,7 @@
           <w:rFonts w:ascii="Arial" w:hAnsi="Arial"/>
           <w:b w:val="0"/>
           <w:i w:val="0"/>
+          <w:color w:val="000000"/>
           <w:sz w:val="22"/>
         </w:rPr>
         <w:t>Apalancados (estructuras, cableado, obra civil): aprovechar el volumen para negociar mejores precios mediante licitaciones o subastas y consolidar la compra en menos proveedores.</w:t>
@@ -3454,6 +3771,7 @@
           <w:rFonts w:ascii="Arial" w:hAnsi="Arial"/>
           <w:b w:val="0"/>
           <w:i w:val="0"/>
+          <w:color w:val="000000"/>
           <w:sz w:val="22"/>
         </w:rPr>
         <w:t>Rutinarios (insumos menores): estandarizar y automatizar con catálogos electrónicos para que el equipo no gaste tiempo en compras de bajo valor.</w:t>
@@ -3463,14 +3781,15 @@
       <w:pPr>
         <w:keepNext/>
         <w:spacing w:before="280" w:after="120"/>
+        <w:jc w:val="center"/>
       </w:pPr>
       <w:r>
         <w:rPr>
           <w:rFonts w:ascii="Arial" w:hAnsi="Arial"/>
           <w:b/>
           <w:i w:val="0"/>
-          <w:color w:val="1F3864"/>
-          <w:sz w:val="26"/>
+          <w:color w:val="000000"/>
+          <w:sz w:val="24"/>
         </w:rPr>
         <w:t>6. Diseño de KPIs</w:t>
       </w:r>
@@ -3484,9 +3803,41 @@
           <w:rFonts w:ascii="Arial" w:hAnsi="Arial"/>
           <w:b w:val="0"/>
           <w:i w:val="0"/>
+          <w:color w:val="000000"/>
           <w:sz w:val="22"/>
         </w:rPr>
-        <w:t>Como se vio en el módulo, medir debe servir para decidir, y no todas las métricas son KPIs: un KPI es una métrica prioritaria ligada a un objetivo estratégico. Propongo cinco KPIs para Evolti, uno por cada dimensión solicitada (eficiencia, desempeño de proveedor, riesgo, cumplimiento y sostenibilidad), siguiendo la lógica de la ficha “diccionario de KPI” del módulo:</w:t>
+        <w:t>Como se vio en el módulo, medir debe servir para decidir, y no todas las métricas son KPIs: un KPI es una métrica prioritaria ligada a un objetivo estratégico. Propongo cinco KPIs para Evolti, uno por cada dimensión solicitada (eficiencia, desempeño de proveedor, riesgo, cumplimiento y sostenibilidad), siguiendo la lógica de la ficha “diccionario de KPI” del módulo (ver Tabla 6).</w:t>
+      </w:r>
+    </w:p>
+    <w:p>
+      <w:pPr>
+        <w:spacing w:before="120" w:after="0"/>
+      </w:pPr>
+      <w:r>
+        <w:rPr>
+          <w:rFonts w:ascii="Arial" w:hAnsi="Arial"/>
+          <w:b/>
+          <w:i w:val="0"/>
+          <w:color w:val="000000"/>
+          <w:sz w:val="20"/>
+        </w:rPr>
+        <w:t>Tabla 6</w:t>
+      </w:r>
+    </w:p>
+    <w:p>
+      <w:pPr>
+        <w:spacing w:after="160"/>
+        <w:jc w:val="left"/>
+      </w:pPr>
+      <w:r>
+        <w:rPr>
+          <w:rFonts w:ascii="Arial" w:hAnsi="Arial"/>
+          <w:b w:val="0"/>
+          <w:i/>
+          <w:color w:val="000000"/>
+          <w:sz w:val="18"/>
+        </w:rPr>
+        <w:t>Tablero de KPIs estratégicos propuesto para Evolti</w:t>
       </w:r>
     </w:p>
     <w:tbl>
@@ -3497,18 +3848,18 @@
         <w:tblLook w:firstColumn="1" w:firstRow="1" w:lastColumn="0" w:lastRow="0" w:noHBand="0" w:noVBand="1" w:val="04A0"/>
       </w:tblPr>
       <w:tblGrid>
-        <w:gridCol w:w="1473"/>
-        <w:gridCol w:w="1473"/>
-        <w:gridCol w:w="1473"/>
-        <w:gridCol w:w="1473"/>
-        <w:gridCol w:w="1473"/>
-        <w:gridCol w:w="1473"/>
+        <w:gridCol w:w="1560"/>
+        <w:gridCol w:w="1560"/>
+        <w:gridCol w:w="1560"/>
+        <w:gridCol w:w="1560"/>
+        <w:gridCol w:w="1560"/>
+        <w:gridCol w:w="1560"/>
       </w:tblGrid>
       <w:tr>
         <w:tc>
           <w:tcPr>
             <w:tcW w:type="dxa" w:w="1872"/>
-            <w:shd w:val="clear" w:color="auto" w:fill="1F3864"/>
+            <w:shd w:val="clear" w:color="auto" w:fill="D9D9D9"/>
           </w:tcPr>
           <w:p>
             <w:r/>
@@ -3517,7 +3868,7 @@
                 <w:rFonts w:ascii="Arial" w:hAnsi="Arial"/>
                 <w:b/>
                 <w:i w:val="0"/>
-                <w:color w:val="FFFFFF"/>
+                <w:color w:val="000000"/>
                 <w:sz w:val="15"/>
               </w:rPr>
               <w:t>KPI (dimensión)</w:t>
@@ -3527,7 +3878,7 @@
         <w:tc>
           <w:tcPr>
             <w:tcW w:type="dxa" w:w="2016"/>
-            <w:shd w:val="clear" w:color="auto" w:fill="1F3864"/>
+            <w:shd w:val="clear" w:color="auto" w:fill="D9D9D9"/>
           </w:tcPr>
           <w:p>
             <w:r/>
@@ -3536,7 +3887,7 @@
                 <w:rFonts w:ascii="Arial" w:hAnsi="Arial"/>
                 <w:b/>
                 <w:i w:val="0"/>
-                <w:color w:val="FFFFFF"/>
+                <w:color w:val="000000"/>
                 <w:sz w:val="15"/>
               </w:rPr>
               <w:t>Fórmula</w:t>
@@ -3546,7 +3897,7 @@
         <w:tc>
           <w:tcPr>
             <w:tcW w:type="dxa" w:w="1584"/>
-            <w:shd w:val="clear" w:color="auto" w:fill="1F3864"/>
+            <w:shd w:val="clear" w:color="auto" w:fill="D9D9D9"/>
           </w:tcPr>
           <w:p>
             <w:r/>
@@ -3555,7 +3906,7 @@
                 <w:rFonts w:ascii="Arial" w:hAnsi="Arial"/>
                 <w:b/>
                 <w:i w:val="0"/>
-                <w:color w:val="FFFFFF"/>
+                <w:color w:val="000000"/>
                 <w:sz w:val="15"/>
               </w:rPr>
               <w:t>Objetivo</w:t>
@@ -3565,7 +3916,7 @@
         <w:tc>
           <w:tcPr>
             <w:tcW w:type="dxa" w:w="1008"/>
-            <w:shd w:val="clear" w:color="auto" w:fill="1F3864"/>
+            <w:shd w:val="clear" w:color="auto" w:fill="D9D9D9"/>
           </w:tcPr>
           <w:p>
             <w:r/>
@@ -3574,7 +3925,7 @@
                 <w:rFonts w:ascii="Arial" w:hAnsi="Arial"/>
                 <w:b/>
                 <w:i w:val="0"/>
-                <w:color w:val="FFFFFF"/>
+                <w:color w:val="000000"/>
                 <w:sz w:val="15"/>
               </w:rPr>
               <w:t>Periodicidad</w:t>
@@ -3584,7 +3935,7 @@
         <w:tc>
           <w:tcPr>
             <w:tcW w:type="dxa" w:w="1296"/>
-            <w:shd w:val="clear" w:color="auto" w:fill="1F3864"/>
+            <w:shd w:val="clear" w:color="auto" w:fill="D9D9D9"/>
           </w:tcPr>
           <w:p>
             <w:r/>
@@ -3593,7 +3944,7 @@
                 <w:rFonts w:ascii="Arial" w:hAnsi="Arial"/>
                 <w:b/>
                 <w:i w:val="0"/>
-                <w:color w:val="FFFFFF"/>
+                <w:color w:val="000000"/>
                 <w:sz w:val="15"/>
               </w:rPr>
               <w:t>Responsable</w:t>
@@ -3603,7 +3954,7 @@
         <w:tc>
           <w:tcPr>
             <w:tcW w:type="dxa" w:w="2016"/>
-            <w:shd w:val="clear" w:color="auto" w:fill="1F3864"/>
+            <w:shd w:val="clear" w:color="auto" w:fill="D9D9D9"/>
           </w:tcPr>
           <w:p>
             <w:r/>
@@ -3612,7 +3963,7 @@
                 <w:rFonts w:ascii="Arial" w:hAnsi="Arial"/>
                 <w:b/>
                 <w:i w:val="0"/>
-                <w:color w:val="FFFFFF"/>
+                <w:color w:val="000000"/>
                 <w:sz w:val="15"/>
               </w:rPr>
               <w:t>Acción correctiva</w:t>
@@ -3632,6 +3983,7 @@
                 <w:rFonts w:ascii="Arial" w:hAnsi="Arial"/>
                 <w:b w:val="0"/>
                 <w:i w:val="0"/>
+                <w:color w:val="000000"/>
                 <w:sz w:val="15"/>
               </w:rPr>
               <w:t>Tiempo de ciclo de compra (Eficiencia)</w:t>
@@ -3649,6 +4001,7 @@
                 <w:rFonts w:ascii="Arial" w:hAnsi="Arial"/>
                 <w:b w:val="0"/>
                 <w:i w:val="0"/>
+                <w:color w:val="000000"/>
                 <w:sz w:val="15"/>
               </w:rPr>
               <w:t>Días desde requisición hasta orden/recepción</w:t>
@@ -3666,6 +4019,7 @@
                 <w:rFonts w:ascii="Arial" w:hAnsi="Arial"/>
                 <w:b w:val="0"/>
                 <w:i w:val="0"/>
+                <w:color w:val="000000"/>
                 <w:sz w:val="15"/>
               </w:rPr>
               <w:t>Reducir el ciclo y las urgencias</w:t>
@@ -3683,6 +4037,7 @@
                 <w:rFonts w:ascii="Arial" w:hAnsi="Arial"/>
                 <w:b w:val="0"/>
                 <w:i w:val="0"/>
+                <w:color w:val="000000"/>
                 <w:sz w:val="15"/>
               </w:rPr>
               <w:t>Mensual</w:t>
@@ -3700,6 +4055,7 @@
                 <w:rFonts w:ascii="Arial" w:hAnsi="Arial"/>
                 <w:b w:val="0"/>
                 <w:i w:val="0"/>
+                <w:color w:val="000000"/>
                 <w:sz w:val="15"/>
               </w:rPr>
               <w:t>Analista de compras</w:t>
@@ -3717,6 +4073,7 @@
                 <w:rFonts w:ascii="Arial" w:hAnsi="Arial"/>
                 <w:b w:val="0"/>
                 <w:i w:val="0"/>
+                <w:color w:val="000000"/>
                 <w:sz w:val="15"/>
               </w:rPr>
               <w:t>Revisar cuellos de botella y anticipar requisiciones.</w:t>
@@ -3736,6 +4093,7 @@
                 <w:rFonts w:ascii="Arial" w:hAnsi="Arial"/>
                 <w:b w:val="0"/>
                 <w:i w:val="0"/>
+                <w:color w:val="000000"/>
                 <w:sz w:val="15"/>
               </w:rPr>
               <w:t>Entrega a tiempo – OTD (Desempeño proveedor)</w:t>
@@ -3753,6 +4111,7 @@
                 <w:rFonts w:ascii="Arial" w:hAnsi="Arial"/>
                 <w:b w:val="0"/>
                 <w:i w:val="0"/>
+                <w:color w:val="000000"/>
                 <w:sz w:val="15"/>
               </w:rPr>
               <w:t>(Entregas a tiempo / total entregas) × 100</w:t>
@@ -3770,6 +4129,7 @@
                 <w:rFonts w:ascii="Arial" w:hAnsi="Arial"/>
                 <w:b w:val="0"/>
                 <w:i w:val="0"/>
+                <w:color w:val="000000"/>
                 <w:sz w:val="15"/>
               </w:rPr>
               <w:t>≥ 92 % de entregas a tiempo</w:t>
@@ -3787,6 +4147,7 @@
                 <w:rFonts w:ascii="Arial" w:hAnsi="Arial"/>
                 <w:b w:val="0"/>
                 <w:i w:val="0"/>
+                <w:color w:val="000000"/>
                 <w:sz w:val="15"/>
               </w:rPr>
               <w:t>Mensual</w:t>
@@ -3804,6 +4165,7 @@
                 <w:rFonts w:ascii="Arial" w:hAnsi="Arial"/>
                 <w:b w:val="0"/>
                 <w:i w:val="0"/>
+                <w:color w:val="000000"/>
                 <w:sz w:val="15"/>
               </w:rPr>
               <w:t>Coordinador de compras</w:t>
@@ -3821,6 +4183,7 @@
                 <w:rFonts w:ascii="Arial" w:hAnsi="Arial"/>
                 <w:b w:val="0"/>
                 <w:i w:val="0"/>
+                <w:color w:val="000000"/>
                 <w:sz w:val="15"/>
               </w:rPr>
               <w:t>Plan de mejora con el proveedor; activar dual sourcing.</w:t>
@@ -3840,6 +4203,7 @@
                 <w:rFonts w:ascii="Arial" w:hAnsi="Arial"/>
                 <w:b w:val="0"/>
                 <w:i w:val="0"/>
+                <w:color w:val="000000"/>
                 <w:sz w:val="15"/>
               </w:rPr>
               <w:t>Proveedores críticos con plan de continuidad (Riesgo)</w:t>
@@ -3857,6 +4221,7 @@
                 <w:rFonts w:ascii="Arial" w:hAnsi="Arial"/>
                 <w:b w:val="0"/>
                 <w:i w:val="0"/>
+                <w:color w:val="000000"/>
                 <w:sz w:val="15"/>
               </w:rPr>
               <w:t>(Críticos con plan / total críticos) × 100</w:t>
@@ -3874,6 +4239,7 @@
                 <w:rFonts w:ascii="Arial" w:hAnsi="Arial"/>
                 <w:b w:val="0"/>
                 <w:i w:val="0"/>
+                <w:color w:val="000000"/>
                 <w:sz w:val="15"/>
               </w:rPr>
               <w:t>100 % de críticos con plan</w:t>
@@ -3891,6 +4257,7 @@
                 <w:rFonts w:ascii="Arial" w:hAnsi="Arial"/>
                 <w:b w:val="0"/>
                 <w:i w:val="0"/>
+                <w:color w:val="000000"/>
                 <w:sz w:val="15"/>
               </w:rPr>
               <w:t>Trimestral</w:t>
@@ -3908,6 +4275,7 @@
                 <w:rFonts w:ascii="Arial" w:hAnsi="Arial"/>
                 <w:b w:val="0"/>
                 <w:i w:val="0"/>
+                <w:color w:val="000000"/>
                 <w:sz w:val="15"/>
               </w:rPr>
               <w:t>Jefe de abastecimiento</w:t>
@@ -3925,6 +4293,7 @@
                 <w:rFonts w:ascii="Arial" w:hAnsi="Arial"/>
                 <w:b w:val="0"/>
                 <w:i w:val="0"/>
+                <w:color w:val="000000"/>
                 <w:sz w:val="15"/>
               </w:rPr>
               <w:t>Diseñar plan de contingencia para los que falten.</w:t>
@@ -3944,6 +4313,7 @@
                 <w:rFonts w:ascii="Arial" w:hAnsi="Arial"/>
                 <w:b w:val="0"/>
                 <w:i w:val="0"/>
+                <w:color w:val="000000"/>
                 <w:sz w:val="15"/>
               </w:rPr>
               <w:t>Gasto bajo contrato / touchless (Cumplimiento)</w:t>
@@ -3961,6 +4331,7 @@
                 <w:rFonts w:ascii="Arial" w:hAnsi="Arial"/>
                 <w:b w:val="0"/>
                 <w:i w:val="0"/>
+                <w:color w:val="000000"/>
                 <w:sz w:val="15"/>
               </w:rPr>
               <w:t>(Compras por canal definido / total) × 100</w:t>
@@ -3978,6 +4349,7 @@
                 <w:rFonts w:ascii="Arial" w:hAnsi="Arial"/>
                 <w:b w:val="0"/>
                 <w:i w:val="0"/>
+                <w:color w:val="000000"/>
                 <w:sz w:val="15"/>
               </w:rPr>
               <w:t>≥ 85 % del gasto bajo contrato</w:t>
@@ -3995,6 +4367,7 @@
                 <w:rFonts w:ascii="Arial" w:hAnsi="Arial"/>
                 <w:b w:val="0"/>
                 <w:i w:val="0"/>
+                <w:color w:val="000000"/>
                 <w:sz w:val="15"/>
               </w:rPr>
               <w:t>Mensual</w:t>
@@ -4012,6 +4385,7 @@
                 <w:rFonts w:ascii="Arial" w:hAnsi="Arial"/>
                 <w:b w:val="0"/>
                 <w:i w:val="0"/>
+                <w:color w:val="000000"/>
                 <w:sz w:val="15"/>
               </w:rPr>
               <w:t>Jefe de abastecimiento</w:t>
@@ -4029,6 +4403,7 @@
                 <w:rFonts w:ascii="Arial" w:hAnsi="Arial"/>
                 <w:b w:val="0"/>
                 <w:i w:val="0"/>
+                <w:color w:val="000000"/>
                 <w:sz w:val="15"/>
               </w:rPr>
               <w:t>Investigar maverick spend y reforzar la política.</w:t>
@@ -4048,6 +4423,7 @@
                 <w:rFonts w:ascii="Arial" w:hAnsi="Arial"/>
                 <w:b w:val="0"/>
                 <w:i w:val="0"/>
+                <w:color w:val="000000"/>
                 <w:sz w:val="15"/>
               </w:rPr>
               <w:t>Compras con criterios sostenibles (Sostenibilidad)</w:t>
@@ -4065,6 +4441,7 @@
                 <w:rFonts w:ascii="Arial" w:hAnsi="Arial"/>
                 <w:b w:val="0"/>
                 <w:i w:val="0"/>
+                <w:color w:val="000000"/>
                 <w:sz w:val="15"/>
               </w:rPr>
               <w:t>(Gasto con criterios ESG / total) × 100</w:t>
@@ -4082,6 +4459,7 @@
                 <w:rFonts w:ascii="Arial" w:hAnsi="Arial"/>
                 <w:b w:val="0"/>
                 <w:i w:val="0"/>
+                <w:color w:val="000000"/>
                 <w:sz w:val="15"/>
               </w:rPr>
               <w:t>≥ 30 % en el primer año (ISO 20400)</w:t>
@@ -4099,6 +4477,7 @@
                 <w:rFonts w:ascii="Arial" w:hAnsi="Arial"/>
                 <w:b w:val="0"/>
                 <w:i w:val="0"/>
+                <w:color w:val="000000"/>
                 <w:sz w:val="15"/>
               </w:rPr>
               <w:t>Trimestral</w:t>
@@ -4116,6 +4495,7 @@
                 <w:rFonts w:ascii="Arial" w:hAnsi="Arial"/>
                 <w:b w:val="0"/>
                 <w:i w:val="0"/>
+                <w:color w:val="000000"/>
                 <w:sz w:val="15"/>
               </w:rPr>
               <w:t>Compras + Gerencia</w:t>
@@ -4133,6 +4513,7 @@
                 <w:rFonts w:ascii="Arial" w:hAnsi="Arial"/>
                 <w:b w:val="0"/>
                 <w:i w:val="0"/>
+                <w:color w:val="000000"/>
                 <w:sz w:val="15"/>
               </w:rPr>
               <w:t>Incluir criterios ESG en pliegos y evaluación.</w:t>
@@ -4156,10 +4537,10 @@
           <w:rFonts w:ascii="Arial" w:hAnsi="Arial"/>
           <w:b w:val="0"/>
           <w:i/>
-          <w:color w:val="444444"/>
-          <w:sz w:val="17"/>
+          <w:color w:val="000000"/>
+          <w:sz w:val="18"/>
         </w:rPr>
-        <w:t>Tabla 6. Tablero de KPIs estratégicos propuesto para Evolti.</w:t>
+        <w:t>Nota. Elaboración propia con base en la Tabla de KPI del Módulo 1 y en la NTC-ISO 20400 (ICONTEC, 2017).</w:t>
       </w:r>
     </w:p>
     <w:p>
@@ -4171,6 +4552,7 @@
           <w:rFonts w:ascii="Arial" w:hAnsi="Arial"/>
           <w:b w:val="0"/>
           <w:i w:val="0"/>
+          <w:color w:val="000000"/>
           <w:sz w:val="22"/>
         </w:rPr>
         <w:t>Cada KPI tendría metas tipo semáforo (verde/amarillo/rojo) para facilitar la lectura gerencial. También hay que cuidar los riesgos de los KPIs vistos en el módulo, como las “métricas vanidosas”, inflar ahorros por doble conteo o el greenwashing en sostenibilidad.</w:t>
@@ -4180,14 +4562,15 @@
       <w:pPr>
         <w:keepNext/>
         <w:spacing w:before="280" w:after="120"/>
+        <w:jc w:val="center"/>
       </w:pPr>
       <w:r>
         <w:rPr>
           <w:rFonts w:ascii="Arial" w:hAnsi="Arial"/>
           <w:b/>
           <w:i w:val="0"/>
-          <w:color w:val="1F3864"/>
-          <w:sz w:val="26"/>
+          <w:color w:val="000000"/>
+          <w:sz w:val="24"/>
         </w:rPr>
         <w:t>7. Diseño del modelo de gobierno de compras</w:t>
       </w:r>
@@ -4202,8 +4585,8 @@
           <w:rFonts w:ascii="Arial" w:hAnsi="Arial"/>
           <w:b/>
           <w:i w:val="0"/>
-          <w:color w:val="0B6E4F"/>
-          <w:sz w:val="23"/>
+          <w:color w:val="000000"/>
+          <w:sz w:val="22"/>
         </w:rPr>
         <w:t>Modelo de compras propuesto</w:t>
       </w:r>
@@ -4217,9 +4600,10 @@
           <w:rFonts w:ascii="Arial" w:hAnsi="Arial"/>
           <w:b w:val="0"/>
           <w:i w:val="0"/>
+          <w:color w:val="000000"/>
           <w:sz w:val="22"/>
         </w:rPr>
-        <w:t>Propongo un modelo híbrido (Modelo C del módulo): las categorías estratégicas (paneles, inversores, estructuras) se compran de forma centralizada para consolidar volumen y negociar mejor, mientras que las compras menores y urgentes de cada proyecto se pueden ejecutar localmente pero bajo reglas claras y con topes definidos. Este modelo equilibra el control con la agilidad, que es justo lo que necesita una empresa que trabaja por proyectos con cronogramas ajustados.</w:t>
+        <w:t>Propongo un modelo híbrido: las categorías estratégicas (paneles, inversores, estructuras) se compran de forma centralizada para consolidar volumen y negociar mejor, mientras que las compras menores y urgentes de cada proyecto se pueden ejecutar localmente pero bajo reglas claras y con topes definidos. Este modelo equilibra el control con la agilidad, que es justo lo que necesita una empresa que trabaja por proyectos con cronogramas ajustados.</w:t>
       </w:r>
     </w:p>
     <w:p>
@@ -4232,8 +4616,8 @@
           <w:rFonts w:ascii="Arial" w:hAnsi="Arial"/>
           <w:b/>
           <w:i w:val="0"/>
-          <w:color w:val="0B6E4F"/>
-          <w:sz w:val="23"/>
+          <w:color w:val="000000"/>
+          <w:sz w:val="22"/>
         </w:rPr>
         <w:t>Matriz básica RACI</w:t>
       </w:r>
@@ -4247,9 +4631,41 @@
           <w:rFonts w:ascii="Arial" w:hAnsi="Arial"/>
           <w:b w:val="0"/>
           <w:i w:val="0"/>
+          <w:color w:val="000000"/>
           <w:sz w:val="22"/>
         </w:rPr>
-        <w:t>La matriz RACI ayuda a clarificar responsabilidades y a reducir riesgos de fraude y reprocesos, separando quién solicita, quién adjudica y quién paga (R = Responsable, A = Aprueba, C = Consultado, I = Informado):</w:t>
+        <w:t>La matriz RACI ayuda a clarificar responsabilidades y a reducir riesgos de fraude y reprocesos, separando quién solicita, quién adjudica y quién paga (R = Responsable, A = Aprueba, C = Consultado, I = Informado). Ver Tabla 7.</w:t>
+      </w:r>
+    </w:p>
+    <w:p>
+      <w:pPr>
+        <w:spacing w:before="120" w:after="0"/>
+      </w:pPr>
+      <w:r>
+        <w:rPr>
+          <w:rFonts w:ascii="Arial" w:hAnsi="Arial"/>
+          <w:b/>
+          <w:i w:val="0"/>
+          <w:color w:val="000000"/>
+          <w:sz w:val="20"/>
+        </w:rPr>
+        <w:t>Tabla 7</w:t>
+      </w:r>
+    </w:p>
+    <w:p>
+      <w:pPr>
+        <w:spacing w:after="160"/>
+        <w:jc w:val="left"/>
+      </w:pPr>
+      <w:r>
+        <w:rPr>
+          <w:rFonts w:ascii="Arial" w:hAnsi="Arial"/>
+          <w:b w:val="0"/>
+          <w:i/>
+          <w:color w:val="000000"/>
+          <w:sz w:val="18"/>
+        </w:rPr>
+        <w:t>Matriz RACI básica del ciclo de compras (Source-to-Pay) en Evolti</w:t>
       </w:r>
     </w:p>
     <w:tbl>
@@ -4260,18 +4676,18 @@
         <w:tblLook w:firstColumn="1" w:firstRow="1" w:lastColumn="0" w:lastRow="0" w:noHBand="0" w:noVBand="1" w:val="04A0"/>
       </w:tblPr>
       <w:tblGrid>
-        <w:gridCol w:w="1473"/>
-        <w:gridCol w:w="1473"/>
-        <w:gridCol w:w="1473"/>
-        <w:gridCol w:w="1473"/>
-        <w:gridCol w:w="1473"/>
-        <w:gridCol w:w="1473"/>
+        <w:gridCol w:w="1560"/>
+        <w:gridCol w:w="1560"/>
+        <w:gridCol w:w="1560"/>
+        <w:gridCol w:w="1560"/>
+        <w:gridCol w:w="1560"/>
+        <w:gridCol w:w="1560"/>
       </w:tblGrid>
       <w:tr>
         <w:tc>
           <w:tcPr>
             <w:tcW w:type="dxa" w:w="2736"/>
-            <w:shd w:val="clear" w:color="auto" w:fill="1F3864"/>
+            <w:shd w:val="clear" w:color="auto" w:fill="D9D9D9"/>
           </w:tcPr>
           <w:p>
             <w:r/>
@@ -4280,7 +4696,7 @@
                 <w:rFonts w:ascii="Arial" w:hAnsi="Arial"/>
                 <w:b/>
                 <w:i w:val="0"/>
-                <w:color w:val="FFFFFF"/>
+                <w:color w:val="000000"/>
                 <w:sz w:val="17"/>
               </w:rPr>
               <w:t>Actividad</w:t>
@@ -4290,7 +4706,7 @@
         <w:tc>
           <w:tcPr>
             <w:tcW w:type="dxa" w:w="1584"/>
-            <w:shd w:val="clear" w:color="auto" w:fill="1F3864"/>
+            <w:shd w:val="clear" w:color="auto" w:fill="D9D9D9"/>
           </w:tcPr>
           <w:p>
             <w:r/>
@@ -4299,7 +4715,7 @@
                 <w:rFonts w:ascii="Arial" w:hAnsi="Arial"/>
                 <w:b/>
                 <w:i w:val="0"/>
-                <w:color w:val="FFFFFF"/>
+                <w:color w:val="000000"/>
                 <w:sz w:val="17"/>
               </w:rPr>
               <w:t>Solicitante (obra)</w:t>
@@ -4309,7 +4725,7 @@
         <w:tc>
           <w:tcPr>
             <w:tcW w:type="dxa" w:w="1440"/>
-            <w:shd w:val="clear" w:color="auto" w:fill="1F3864"/>
+            <w:shd w:val="clear" w:color="auto" w:fill="D9D9D9"/>
           </w:tcPr>
           <w:p>
             <w:r/>
@@ -4318,7 +4734,7 @@
                 <w:rFonts w:ascii="Arial" w:hAnsi="Arial"/>
                 <w:b/>
                 <w:i w:val="0"/>
-                <w:color w:val="FFFFFF"/>
+                <w:color w:val="000000"/>
                 <w:sz w:val="17"/>
               </w:rPr>
               <w:t>Analista compras</w:t>
@@ -4328,7 +4744,7 @@
         <w:tc>
           <w:tcPr>
             <w:tcW w:type="dxa" w:w="1296"/>
-            <w:shd w:val="clear" w:color="auto" w:fill="1F3864"/>
+            <w:shd w:val="clear" w:color="auto" w:fill="D9D9D9"/>
           </w:tcPr>
           <w:p>
             <w:r/>
@@ -4337,7 +4753,7 @@
                 <w:rFonts w:ascii="Arial" w:hAnsi="Arial"/>
                 <w:b/>
                 <w:i w:val="0"/>
-                <w:color w:val="FFFFFF"/>
+                <w:color w:val="000000"/>
                 <w:sz w:val="17"/>
               </w:rPr>
               <w:t>Jefe abastec.</w:t>
@@ -4347,7 +4763,7 @@
         <w:tc>
           <w:tcPr>
             <w:tcW w:type="dxa" w:w="1152"/>
-            <w:shd w:val="clear" w:color="auto" w:fill="1F3864"/>
+            <w:shd w:val="clear" w:color="auto" w:fill="D9D9D9"/>
           </w:tcPr>
           <w:p>
             <w:r/>
@@ -4356,7 +4772,7 @@
                 <w:rFonts w:ascii="Arial" w:hAnsi="Arial"/>
                 <w:b/>
                 <w:i w:val="0"/>
-                <w:color w:val="FFFFFF"/>
+                <w:color w:val="000000"/>
                 <w:sz w:val="17"/>
               </w:rPr>
               <w:t>Gerencia</w:t>
@@ -4366,7 +4782,7 @@
         <w:tc>
           <w:tcPr>
             <w:tcW w:type="dxa" w:w="1152"/>
-            <w:shd w:val="clear" w:color="auto" w:fill="1F3864"/>
+            <w:shd w:val="clear" w:color="auto" w:fill="D9D9D9"/>
           </w:tcPr>
           <w:p>
             <w:r/>
@@ -4375,7 +4791,7 @@
                 <w:rFonts w:ascii="Arial" w:hAnsi="Arial"/>
                 <w:b/>
                 <w:i w:val="0"/>
-                <w:color w:val="FFFFFF"/>
+                <w:color w:val="000000"/>
                 <w:sz w:val="17"/>
               </w:rPr>
               <w:t>Finanzas</w:t>
@@ -4395,6 +4811,7 @@
                 <w:rFonts w:ascii="Arial" w:hAnsi="Arial"/>
                 <w:b w:val="0"/>
                 <w:i w:val="0"/>
+                <w:color w:val="000000"/>
                 <w:sz w:val="17"/>
               </w:rPr>
               <w:t>Generar requisición</w:t>
@@ -4412,6 +4829,7 @@
                 <w:rFonts w:ascii="Arial" w:hAnsi="Arial"/>
                 <w:b w:val="0"/>
                 <w:i w:val="0"/>
+                <w:color w:val="000000"/>
                 <w:sz w:val="17"/>
               </w:rPr>
               <w:t>R</w:t>
@@ -4429,6 +4847,7 @@
                 <w:rFonts w:ascii="Arial" w:hAnsi="Arial"/>
                 <w:b w:val="0"/>
                 <w:i w:val="0"/>
+                <w:color w:val="000000"/>
                 <w:sz w:val="17"/>
               </w:rPr>
               <w:t>C</w:t>
@@ -4446,6 +4865,7 @@
                 <w:rFonts w:ascii="Arial" w:hAnsi="Arial"/>
                 <w:b w:val="0"/>
                 <w:i w:val="0"/>
+                <w:color w:val="000000"/>
                 <w:sz w:val="17"/>
               </w:rPr>
               <w:t>I</w:t>
@@ -4463,6 +4883,7 @@
                 <w:rFonts w:ascii="Arial" w:hAnsi="Arial"/>
                 <w:b w:val="0"/>
                 <w:i w:val="0"/>
+                <w:color w:val="000000"/>
                 <w:sz w:val="17"/>
               </w:rPr>
             </w:r>
@@ -4479,6 +4900,7 @@
                 <w:rFonts w:ascii="Arial" w:hAnsi="Arial"/>
                 <w:b w:val="0"/>
                 <w:i w:val="0"/>
+                <w:color w:val="000000"/>
                 <w:sz w:val="17"/>
               </w:rPr>
             </w:r>
@@ -4497,6 +4919,7 @@
                 <w:rFonts w:ascii="Arial" w:hAnsi="Arial"/>
                 <w:b w:val="0"/>
                 <w:i w:val="0"/>
+                <w:color w:val="000000"/>
                 <w:sz w:val="17"/>
               </w:rPr>
               <w:t>Cotizar y comparar</w:t>
@@ -4514,6 +4937,7 @@
                 <w:rFonts w:ascii="Arial" w:hAnsi="Arial"/>
                 <w:b w:val="0"/>
                 <w:i w:val="0"/>
+                <w:color w:val="000000"/>
                 <w:sz w:val="17"/>
               </w:rPr>
               <w:t>C</w:t>
@@ -4531,6 +4955,7 @@
                 <w:rFonts w:ascii="Arial" w:hAnsi="Arial"/>
                 <w:b w:val="0"/>
                 <w:i w:val="0"/>
+                <w:color w:val="000000"/>
                 <w:sz w:val="17"/>
               </w:rPr>
               <w:t>R</w:t>
@@ -4548,6 +4973,7 @@
                 <w:rFonts w:ascii="Arial" w:hAnsi="Arial"/>
                 <w:b w:val="0"/>
                 <w:i w:val="0"/>
+                <w:color w:val="000000"/>
                 <w:sz w:val="17"/>
               </w:rPr>
               <w:t>A</w:t>
@@ -4565,6 +4991,7 @@
                 <w:rFonts w:ascii="Arial" w:hAnsi="Arial"/>
                 <w:b w:val="0"/>
                 <w:i w:val="0"/>
+                <w:color w:val="000000"/>
                 <w:sz w:val="17"/>
               </w:rPr>
             </w:r>
@@ -4581,6 +5008,7 @@
                 <w:rFonts w:ascii="Arial" w:hAnsi="Arial"/>
                 <w:b w:val="0"/>
                 <w:i w:val="0"/>
+                <w:color w:val="000000"/>
                 <w:sz w:val="17"/>
               </w:rPr>
             </w:r>
@@ -4599,6 +5027,7 @@
                 <w:rFonts w:ascii="Arial" w:hAnsi="Arial"/>
                 <w:b w:val="0"/>
                 <w:i w:val="0"/>
+                <w:color w:val="000000"/>
                 <w:sz w:val="17"/>
               </w:rPr>
               <w:t>Adjudicar / seleccionar</w:t>
@@ -4616,6 +5045,7 @@
                 <w:rFonts w:ascii="Arial" w:hAnsi="Arial"/>
                 <w:b w:val="0"/>
                 <w:i w:val="0"/>
+                <w:color w:val="000000"/>
                 <w:sz w:val="17"/>
               </w:rPr>
             </w:r>
@@ -4632,6 +5062,7 @@
                 <w:rFonts w:ascii="Arial" w:hAnsi="Arial"/>
                 <w:b w:val="0"/>
                 <w:i w:val="0"/>
+                <w:color w:val="000000"/>
                 <w:sz w:val="17"/>
               </w:rPr>
               <w:t>R</w:t>
@@ -4649,6 +5080,7 @@
                 <w:rFonts w:ascii="Arial" w:hAnsi="Arial"/>
                 <w:b w:val="0"/>
                 <w:i w:val="0"/>
+                <w:color w:val="000000"/>
                 <w:sz w:val="17"/>
               </w:rPr>
               <w:t>A</w:t>
@@ -4666,6 +5098,7 @@
                 <w:rFonts w:ascii="Arial" w:hAnsi="Arial"/>
                 <w:b w:val="0"/>
                 <w:i w:val="0"/>
+                <w:color w:val="000000"/>
                 <w:sz w:val="17"/>
               </w:rPr>
               <w:t>C</w:t>
@@ -4683,6 +5116,7 @@
                 <w:rFonts w:ascii="Arial" w:hAnsi="Arial"/>
                 <w:b w:val="0"/>
                 <w:i w:val="0"/>
+                <w:color w:val="000000"/>
                 <w:sz w:val="17"/>
               </w:rPr>
             </w:r>
@@ -4701,6 +5135,7 @@
                 <w:rFonts w:ascii="Arial" w:hAnsi="Arial"/>
                 <w:b w:val="0"/>
                 <w:i w:val="0"/>
+                <w:color w:val="000000"/>
                 <w:sz w:val="17"/>
               </w:rPr>
               <w:t>Aprobar contrato/OC (según umbral)</w:t>
@@ -4718,6 +5153,7 @@
                 <w:rFonts w:ascii="Arial" w:hAnsi="Arial"/>
                 <w:b w:val="0"/>
                 <w:i w:val="0"/>
+                <w:color w:val="000000"/>
                 <w:sz w:val="17"/>
               </w:rPr>
             </w:r>
@@ -4734,6 +5170,7 @@
                 <w:rFonts w:ascii="Arial" w:hAnsi="Arial"/>
                 <w:b w:val="0"/>
                 <w:i w:val="0"/>
+                <w:color w:val="000000"/>
                 <w:sz w:val="17"/>
               </w:rPr>
               <w:t>C</w:t>
@@ -4751,6 +5188,7 @@
                 <w:rFonts w:ascii="Arial" w:hAnsi="Arial"/>
                 <w:b w:val="0"/>
                 <w:i w:val="0"/>
+                <w:color w:val="000000"/>
                 <w:sz w:val="17"/>
               </w:rPr>
               <w:t>R</w:t>
@@ -4768,6 +5206,7 @@
                 <w:rFonts w:ascii="Arial" w:hAnsi="Arial"/>
                 <w:b w:val="0"/>
                 <w:i w:val="0"/>
+                <w:color w:val="000000"/>
                 <w:sz w:val="17"/>
               </w:rPr>
               <w:t>A</w:t>
@@ -4785,6 +5224,7 @@
                 <w:rFonts w:ascii="Arial" w:hAnsi="Arial"/>
                 <w:b w:val="0"/>
                 <w:i w:val="0"/>
+                <w:color w:val="000000"/>
                 <w:sz w:val="17"/>
               </w:rPr>
               <w:t>I</w:t>
@@ -4804,6 +5244,7 @@
                 <w:rFonts w:ascii="Arial" w:hAnsi="Arial"/>
                 <w:b w:val="0"/>
                 <w:i w:val="0"/>
+                <w:color w:val="000000"/>
                 <w:sz w:val="17"/>
               </w:rPr>
               <w:t>Recibir bien/servicio</w:t>
@@ -4821,6 +5262,7 @@
                 <w:rFonts w:ascii="Arial" w:hAnsi="Arial"/>
                 <w:b w:val="0"/>
                 <w:i w:val="0"/>
+                <w:color w:val="000000"/>
                 <w:sz w:val="17"/>
               </w:rPr>
               <w:t>R</w:t>
@@ -4838,6 +5280,7 @@
                 <w:rFonts w:ascii="Arial" w:hAnsi="Arial"/>
                 <w:b w:val="0"/>
                 <w:i w:val="0"/>
+                <w:color w:val="000000"/>
                 <w:sz w:val="17"/>
               </w:rPr>
               <w:t>C</w:t>
@@ -4855,6 +5298,7 @@
                 <w:rFonts w:ascii="Arial" w:hAnsi="Arial"/>
                 <w:b w:val="0"/>
                 <w:i w:val="0"/>
+                <w:color w:val="000000"/>
                 <w:sz w:val="17"/>
               </w:rPr>
               <w:t>I</w:t>
@@ -4872,6 +5316,7 @@
                 <w:rFonts w:ascii="Arial" w:hAnsi="Arial"/>
                 <w:b w:val="0"/>
                 <w:i w:val="0"/>
+                <w:color w:val="000000"/>
                 <w:sz w:val="17"/>
               </w:rPr>
             </w:r>
@@ -4888,6 +5333,7 @@
                 <w:rFonts w:ascii="Arial" w:hAnsi="Arial"/>
                 <w:b w:val="0"/>
                 <w:i w:val="0"/>
+                <w:color w:val="000000"/>
                 <w:sz w:val="17"/>
               </w:rPr>
             </w:r>
@@ -4906,6 +5352,7 @@
                 <w:rFonts w:ascii="Arial" w:hAnsi="Arial"/>
                 <w:b w:val="0"/>
                 <w:i w:val="0"/>
+                <w:color w:val="000000"/>
                 <w:sz w:val="17"/>
               </w:rPr>
               <w:t>Pagar al proveedor</w:t>
@@ -4923,6 +5370,7 @@
                 <w:rFonts w:ascii="Arial" w:hAnsi="Arial"/>
                 <w:b w:val="0"/>
                 <w:i w:val="0"/>
+                <w:color w:val="000000"/>
                 <w:sz w:val="17"/>
               </w:rPr>
             </w:r>
@@ -4939,6 +5387,7 @@
                 <w:rFonts w:ascii="Arial" w:hAnsi="Arial"/>
                 <w:b w:val="0"/>
                 <w:i w:val="0"/>
+                <w:color w:val="000000"/>
                 <w:sz w:val="17"/>
               </w:rPr>
             </w:r>
@@ -4955,6 +5404,7 @@
                 <w:rFonts w:ascii="Arial" w:hAnsi="Arial"/>
                 <w:b w:val="0"/>
                 <w:i w:val="0"/>
+                <w:color w:val="000000"/>
                 <w:sz w:val="17"/>
               </w:rPr>
               <w:t>I</w:t>
@@ -4972,6 +5422,7 @@
                 <w:rFonts w:ascii="Arial" w:hAnsi="Arial"/>
                 <w:b w:val="0"/>
                 <w:i w:val="0"/>
+                <w:color w:val="000000"/>
                 <w:sz w:val="17"/>
               </w:rPr>
               <w:t>C</w:t>
@@ -4989,6 +5440,7 @@
                 <w:rFonts w:ascii="Arial" w:hAnsi="Arial"/>
                 <w:b w:val="0"/>
                 <w:i w:val="0"/>
+                <w:color w:val="000000"/>
                 <w:sz w:val="17"/>
               </w:rPr>
               <w:t>R/A</w:t>
@@ -5012,10 +5464,10 @@
           <w:rFonts w:ascii="Arial" w:hAnsi="Arial"/>
           <w:b w:val="0"/>
           <w:i/>
-          <w:color w:val="444444"/>
-          <w:sz w:val="17"/>
+          <w:color w:val="000000"/>
+          <w:sz w:val="18"/>
         </w:rPr>
-        <w:t>Tabla 7. Matriz RACI básica del ciclo de compras (Source-to-Pay) en Evolti.</w:t>
+        <w:t>Nota. Elaboración propia.</w:t>
       </w:r>
     </w:p>
     <w:p>
@@ -5028,8 +5480,8 @@
           <w:rFonts w:ascii="Arial" w:hAnsi="Arial"/>
           <w:b/>
           <w:i w:val="0"/>
-          <w:color w:val="0B6E4F"/>
-          <w:sz w:val="23"/>
+          <w:color w:val="000000"/>
+          <w:sz w:val="22"/>
         </w:rPr>
         <w:t>Umbrales de aprobación</w:t>
       </w:r>
@@ -5043,9 +5495,41 @@
           <w:rFonts w:ascii="Arial" w:hAnsi="Arial"/>
           <w:b w:val="0"/>
           <w:i w:val="0"/>
+          <w:color w:val="000000"/>
           <w:sz w:val="22"/>
         </w:rPr>
-        <w:t>Defino umbrales para que el nivel de aprobación dependa del monto, de modo que las compras pequeñas fluyan rápido y las grandes tengan más control:</w:t>
+        <w:t>Defino umbrales para que el nivel de aprobación dependa del monto, de modo que las compras pequeñas fluyan rápido y las grandes tengan más control (ver Tabla 8).</w:t>
+      </w:r>
+    </w:p>
+    <w:p>
+      <w:pPr>
+        <w:spacing w:before="120" w:after="0"/>
+      </w:pPr>
+      <w:r>
+        <w:rPr>
+          <w:rFonts w:ascii="Arial" w:hAnsi="Arial"/>
+          <w:b/>
+          <w:i w:val="0"/>
+          <w:color w:val="000000"/>
+          <w:sz w:val="20"/>
+        </w:rPr>
+        <w:t>Tabla 8</w:t>
+      </w:r>
+    </w:p>
+    <w:p>
+      <w:pPr>
+        <w:spacing w:after="160"/>
+        <w:jc w:val="left"/>
+      </w:pPr>
+      <w:r>
+        <w:rPr>
+          <w:rFonts w:ascii="Arial" w:hAnsi="Arial"/>
+          <w:b w:val="0"/>
+          <w:i/>
+          <w:color w:val="000000"/>
+          <w:sz w:val="18"/>
+        </w:rPr>
+        <w:t>Umbrales de aprobación propuestos (montos ilustrativos)</w:t>
       </w:r>
     </w:p>
     <w:tbl>
@@ -5056,15 +5540,15 @@
         <w:tblLook w:firstColumn="1" w:firstRow="1" w:lastColumn="0" w:lastRow="0" w:noHBand="0" w:noVBand="1" w:val="04A0"/>
       </w:tblPr>
       <w:tblGrid>
-        <w:gridCol w:w="2946"/>
-        <w:gridCol w:w="2946"/>
-        <w:gridCol w:w="2946"/>
+        <w:gridCol w:w="3120"/>
+        <w:gridCol w:w="3120"/>
+        <w:gridCol w:w="3120"/>
       </w:tblGrid>
       <w:tr>
         <w:tc>
           <w:tcPr>
             <w:tcW w:type="dxa" w:w="2592"/>
-            <w:shd w:val="clear" w:color="auto" w:fill="1F3864"/>
+            <w:shd w:val="clear" w:color="auto" w:fill="D9D9D9"/>
           </w:tcPr>
           <w:p>
             <w:r/>
@@ -5073,7 +5557,7 @@
                 <w:rFonts w:ascii="Arial" w:hAnsi="Arial"/>
                 <w:b/>
                 <w:i w:val="0"/>
-                <w:color w:val="FFFFFF"/>
+                <w:color w:val="000000"/>
                 <w:sz w:val="18"/>
               </w:rPr>
               <w:t>Rango de la compra</w:t>
@@ -5083,7 +5567,7 @@
         <w:tc>
           <w:tcPr>
             <w:tcW w:type="dxa" w:w="3600"/>
-            <w:shd w:val="clear" w:color="auto" w:fill="1F3864"/>
+            <w:shd w:val="clear" w:color="auto" w:fill="D9D9D9"/>
           </w:tcPr>
           <w:p>
             <w:r/>
@@ -5092,7 +5576,7 @@
                 <w:rFonts w:ascii="Arial" w:hAnsi="Arial"/>
                 <w:b/>
                 <w:i w:val="0"/>
-                <w:color w:val="FFFFFF"/>
+                <w:color w:val="000000"/>
                 <w:sz w:val="18"/>
               </w:rPr>
               <w:t>Aprobación requerida</w:t>
@@ -5102,7 +5586,7 @@
         <w:tc>
           <w:tcPr>
             <w:tcW w:type="dxa" w:w="2592"/>
-            <w:shd w:val="clear" w:color="auto" w:fill="1F3864"/>
+            <w:shd w:val="clear" w:color="auto" w:fill="D9D9D9"/>
           </w:tcPr>
           <w:p>
             <w:r/>
@@ -5111,7 +5595,7 @@
                 <w:rFonts w:ascii="Arial" w:hAnsi="Arial"/>
                 <w:b/>
                 <w:i w:val="0"/>
-                <w:color w:val="FFFFFF"/>
+                <w:color w:val="000000"/>
                 <w:sz w:val="18"/>
               </w:rPr>
               <w:t>Requisito mínimo</w:t>
@@ -5131,6 +5615,7 @@
                 <w:rFonts w:ascii="Arial" w:hAnsi="Arial"/>
                 <w:b w:val="0"/>
                 <w:i w:val="0"/>
+                <w:color w:val="000000"/>
                 <w:sz w:val="18"/>
               </w:rPr>
               <w:t>Hasta $10 MM</w:t>
@@ -5148,6 +5633,7 @@
                 <w:rFonts w:ascii="Arial" w:hAnsi="Arial"/>
                 <w:b w:val="0"/>
                 <w:i w:val="0"/>
+                <w:color w:val="000000"/>
                 <w:sz w:val="18"/>
               </w:rPr>
               <w:t>Jefe de abastecimiento</w:t>
@@ -5165,6 +5651,7 @@
                 <w:rFonts w:ascii="Arial" w:hAnsi="Arial"/>
                 <w:b w:val="0"/>
                 <w:i w:val="0"/>
+                <w:color w:val="000000"/>
                 <w:sz w:val="18"/>
               </w:rPr>
               <w:t>1 cotización</w:t>
@@ -5184,6 +5671,7 @@
                 <w:rFonts w:ascii="Arial" w:hAnsi="Arial"/>
                 <w:b w:val="0"/>
                 <w:i w:val="0"/>
+                <w:color w:val="000000"/>
                 <w:sz w:val="18"/>
               </w:rPr>
               <w:t>$10 MM – $50 MM</w:t>
@@ -5201,6 +5689,7 @@
                 <w:rFonts w:ascii="Arial" w:hAnsi="Arial"/>
                 <w:b w:val="0"/>
                 <w:i w:val="0"/>
+                <w:color w:val="000000"/>
                 <w:sz w:val="18"/>
               </w:rPr>
               <w:t>Jefe de abastecimiento + Gerencia de proyecto</w:t>
@@ -5218,6 +5707,7 @@
                 <w:rFonts w:ascii="Arial" w:hAnsi="Arial"/>
                 <w:b w:val="0"/>
                 <w:i w:val="0"/>
+                <w:color w:val="000000"/>
                 <w:sz w:val="18"/>
               </w:rPr>
               <w:t>Mínimo 3 cotizaciones</w:t>
@@ -5237,6 +5727,7 @@
                 <w:rFonts w:ascii="Arial" w:hAnsi="Arial"/>
                 <w:b w:val="0"/>
                 <w:i w:val="0"/>
+                <w:color w:val="000000"/>
                 <w:sz w:val="18"/>
               </w:rPr>
               <w:t>$50 MM – $200 MM</w:t>
@@ -5254,6 +5745,7 @@
                 <w:rFonts w:ascii="Arial" w:hAnsi="Arial"/>
                 <w:b w:val="0"/>
                 <w:i w:val="0"/>
+                <w:color w:val="000000"/>
                 <w:sz w:val="18"/>
               </w:rPr>
               <w:t>Gerencia general</w:t>
@@ -5271,6 +5763,7 @@
                 <w:rFonts w:ascii="Arial" w:hAnsi="Arial"/>
                 <w:b w:val="0"/>
                 <w:i w:val="0"/>
+                <w:color w:val="000000"/>
                 <w:sz w:val="18"/>
               </w:rPr>
               <w:t>Comité de compras + evaluación</w:t>
@@ -5290,6 +5783,7 @@
                 <w:rFonts w:ascii="Arial" w:hAnsi="Arial"/>
                 <w:b w:val="0"/>
                 <w:i w:val="0"/>
+                <w:color w:val="000000"/>
                 <w:sz w:val="18"/>
               </w:rPr>
               <w:t>Más de $200 MM</w:t>
@@ -5307,6 +5801,7 @@
                 <w:rFonts w:ascii="Arial" w:hAnsi="Arial"/>
                 <w:b w:val="0"/>
                 <w:i w:val="0"/>
+                <w:color w:val="000000"/>
                 <w:sz w:val="18"/>
               </w:rPr>
               <w:t>Comité directivo / Junta</w:t>
@@ -5324,6 +5819,7 @@
                 <w:rFonts w:ascii="Arial" w:hAnsi="Arial"/>
                 <w:b w:val="0"/>
                 <w:i w:val="0"/>
+                <w:color w:val="000000"/>
                 <w:sz w:val="18"/>
               </w:rPr>
               <w:t>Proceso formal y contrato</w:t>
@@ -5347,10 +5843,10 @@
           <w:rFonts w:ascii="Arial" w:hAnsi="Arial"/>
           <w:b w:val="0"/>
           <w:i/>
-          <w:color w:val="444444"/>
-          <w:sz w:val="17"/>
+          <w:color w:val="000000"/>
+          <w:sz w:val="18"/>
         </w:rPr>
-        <w:t>Tabla 8. Umbrales de aprobación propuestos (montos ilustrativos).</w:t>
+        <w:t>Nota. Montos ilustrativos con fines académicos.</w:t>
       </w:r>
     </w:p>
     <w:p>
@@ -5363,8 +5859,8 @@
           <w:rFonts w:ascii="Arial" w:hAnsi="Arial"/>
           <w:b/>
           <w:i w:val="0"/>
-          <w:color w:val="0B6E4F"/>
-          <w:sz w:val="23"/>
+          <w:color w:val="000000"/>
+          <w:sz w:val="22"/>
         </w:rPr>
         <w:t>Controles internos recomendados</w:t>
       </w:r>
@@ -5379,6 +5875,7 @@
           <w:rFonts w:ascii="Arial" w:hAnsi="Arial"/>
           <w:b w:val="0"/>
           <w:i w:val="0"/>
+          <w:color w:val="000000"/>
           <w:sz w:val="22"/>
         </w:rPr>
         <w:t>Segregación de funciones: que quien pide no sea quien aprueba ni quien paga.</w:t>
@@ -5394,6 +5891,7 @@
           <w:rFonts w:ascii="Arial" w:hAnsi="Arial"/>
           <w:b w:val="0"/>
           <w:i w:val="0"/>
+          <w:color w:val="000000"/>
           <w:sz w:val="22"/>
         </w:rPr>
         <w:t>Exigir mínimo tres cotizaciones a partir de cierto monto y dejar registro de la comparación.</w:t>
@@ -5409,6 +5907,7 @@
           <w:rFonts w:ascii="Arial" w:hAnsi="Arial"/>
           <w:b w:val="0"/>
           <w:i w:val="0"/>
+          <w:color w:val="000000"/>
           <w:sz w:val="22"/>
         </w:rPr>
         <w:t>Uso de contratos marco y catálogos para reducir el maverick spend.</w:t>
@@ -5424,6 +5923,7 @@
           <w:rFonts w:ascii="Arial" w:hAnsi="Arial"/>
           <w:b w:val="0"/>
           <w:i w:val="0"/>
+          <w:color w:val="000000"/>
           <w:sz w:val="22"/>
         </w:rPr>
         <w:t>Registro y trazabilidad de todo el ciclo en una herramienta (aunque sea básica al principio).</w:t>
@@ -5439,6 +5939,7 @@
           <w:rFonts w:ascii="Arial" w:hAnsi="Arial"/>
           <w:b w:val="0"/>
           <w:i w:val="0"/>
+          <w:color w:val="000000"/>
           <w:sz w:val="22"/>
         </w:rPr>
         <w:t>Declaración de conflictos de interés y rotación/revisión de proveedores para prevenir colusión.</w:t>
@@ -5448,14 +5949,15 @@
       <w:pPr>
         <w:keepNext/>
         <w:spacing w:before="280" w:after="120"/>
+        <w:jc w:val="center"/>
       </w:pPr>
       <w:r>
         <w:rPr>
           <w:rFonts w:ascii="Arial" w:hAnsi="Arial"/>
           <w:b/>
           <w:i w:val="0"/>
-          <w:color w:val="1F3864"/>
-          <w:sz w:val="26"/>
+          <w:color w:val="000000"/>
+          <w:sz w:val="24"/>
         </w:rPr>
         <w:t>8. Plan de transformación estratégica (12 meses)</w:t>
       </w:r>
@@ -5469,9 +5971,41 @@
           <w:rFonts w:ascii="Arial" w:hAnsi="Arial"/>
           <w:b w:val="0"/>
           <w:i w:val="0"/>
+          <w:color w:val="000000"/>
           <w:sz w:val="22"/>
         </w:rPr>
-        <w:t>Propongo un plan a 12 meses organizado en tres fases, pensando en que Evolti tiene un equipo pequeño y no puede hacer todo de una vez. La lógica es primero ordenar los datos, luego negociar donde más impacta y por último consolidar el gobierno y la sostenibilidad.</w:t>
+        <w:t>Propongo un plan a 12 meses organizado en tres fases, pensando en que Evolti tiene un equipo pequeño y no puede hacer todo de una vez. La lógica es primero ordenar los datos, luego negociar donde más impacta y por último consolidar el gobierno y la sostenibilidad (ver Tabla 9).</w:t>
+      </w:r>
+    </w:p>
+    <w:p>
+      <w:pPr>
+        <w:spacing w:before="120" w:after="0"/>
+      </w:pPr>
+      <w:r>
+        <w:rPr>
+          <w:rFonts w:ascii="Arial" w:hAnsi="Arial"/>
+          <w:b/>
+          <w:i w:val="0"/>
+          <w:color w:val="000000"/>
+          <w:sz w:val="20"/>
+        </w:rPr>
+        <w:t>Tabla 9</w:t>
+      </w:r>
+    </w:p>
+    <w:p>
+      <w:pPr>
+        <w:spacing w:after="160"/>
+        <w:jc w:val="left"/>
+      </w:pPr>
+      <w:r>
+        <w:rPr>
+          <w:rFonts w:ascii="Arial" w:hAnsi="Arial"/>
+          <w:b w:val="0"/>
+          <w:i/>
+          <w:color w:val="000000"/>
+          <w:sz w:val="18"/>
+        </w:rPr>
+        <w:t>Plan de transformación a 12 meses para Evolti</w:t>
       </w:r>
     </w:p>
     <w:tbl>
@@ -5482,17 +6016,17 @@
         <w:tblLook w:firstColumn="1" w:firstRow="1" w:lastColumn="0" w:lastRow="0" w:noHBand="0" w:noVBand="1" w:val="04A0"/>
       </w:tblPr>
       <w:tblGrid>
-        <w:gridCol w:w="1768"/>
-        <w:gridCol w:w="1768"/>
-        <w:gridCol w:w="1768"/>
-        <w:gridCol w:w="1768"/>
-        <w:gridCol w:w="1768"/>
+        <w:gridCol w:w="1872"/>
+        <w:gridCol w:w="1872"/>
+        <w:gridCol w:w="1872"/>
+        <w:gridCol w:w="1872"/>
+        <w:gridCol w:w="1872"/>
       </w:tblGrid>
       <w:tr>
         <w:tc>
           <w:tcPr>
             <w:tcW w:type="dxa" w:w="2160"/>
-            <w:shd w:val="clear" w:color="auto" w:fill="1F3864"/>
+            <w:shd w:val="clear" w:color="auto" w:fill="D9D9D9"/>
           </w:tcPr>
           <w:p>
             <w:r/>
@@ -5501,7 +6035,7 @@
                 <w:rFonts w:ascii="Arial" w:hAnsi="Arial"/>
                 <w:b/>
                 <w:i w:val="0"/>
-                <w:color w:val="FFFFFF"/>
+                <w:color w:val="000000"/>
                 <w:sz w:val="16"/>
               </w:rPr>
               <w:t>Fase / Objetivo</w:t>
@@ -5511,7 +6045,7 @@
         <w:tc>
           <w:tcPr>
             <w:tcW w:type="dxa" w:w="2736"/>
-            <w:shd w:val="clear" w:color="auto" w:fill="1F3864"/>
+            <w:shd w:val="clear" w:color="auto" w:fill="D9D9D9"/>
           </w:tcPr>
           <w:p>
             <w:r/>
@@ -5520,7 +6054,7 @@
                 <w:rFonts w:ascii="Arial" w:hAnsi="Arial"/>
                 <w:b/>
                 <w:i w:val="0"/>
-                <w:color w:val="FFFFFF"/>
+                <w:color w:val="000000"/>
                 <w:sz w:val="16"/>
               </w:rPr>
               <w:t>Acciones principales</w:t>
@@ -5530,7 +6064,7 @@
         <w:tc>
           <w:tcPr>
             <w:tcW w:type="dxa" w:w="1440"/>
-            <w:shd w:val="clear" w:color="auto" w:fill="1F3864"/>
+            <w:shd w:val="clear" w:color="auto" w:fill="D9D9D9"/>
           </w:tcPr>
           <w:p>
             <w:r/>
@@ -5539,7 +6073,7 @@
                 <w:rFonts w:ascii="Arial" w:hAnsi="Arial"/>
                 <w:b/>
                 <w:i w:val="0"/>
-                <w:color w:val="FFFFFF"/>
+                <w:color w:val="000000"/>
                 <w:sz w:val="16"/>
               </w:rPr>
               <w:t>Responsable</w:t>
@@ -5549,7 +6083,7 @@
         <w:tc>
           <w:tcPr>
             <w:tcW w:type="dxa" w:w="1728"/>
-            <w:shd w:val="clear" w:color="auto" w:fill="1F3864"/>
+            <w:shd w:val="clear" w:color="auto" w:fill="D9D9D9"/>
           </w:tcPr>
           <w:p>
             <w:r/>
@@ -5558,7 +6092,7 @@
                 <w:rFonts w:ascii="Arial" w:hAnsi="Arial"/>
                 <w:b/>
                 <w:i w:val="0"/>
-                <w:color w:val="FFFFFF"/>
+                <w:color w:val="000000"/>
                 <w:sz w:val="16"/>
               </w:rPr>
               <w:t>Indicador</w:t>
@@ -5568,7 +6102,7 @@
         <w:tc>
           <w:tcPr>
             <w:tcW w:type="dxa" w:w="2160"/>
-            <w:shd w:val="clear" w:color="auto" w:fill="1F3864"/>
+            <w:shd w:val="clear" w:color="auto" w:fill="D9D9D9"/>
           </w:tcPr>
           <w:p>
             <w:r/>
@@ -5577,7 +6111,7 @@
                 <w:rFonts w:ascii="Arial" w:hAnsi="Arial"/>
                 <w:b/>
                 <w:i w:val="0"/>
-                <w:color w:val="FFFFFF"/>
+                <w:color w:val="000000"/>
                 <w:sz w:val="16"/>
               </w:rPr>
               <w:t>Beneficio esperado</w:t>
@@ -5597,6 +6131,7 @@
                 <w:rFonts w:ascii="Arial" w:hAnsi="Arial"/>
                 <w:b w:val="0"/>
                 <w:i w:val="0"/>
+                <w:color w:val="000000"/>
                 <w:sz w:val="16"/>
               </w:rPr>
               <w:t>Fase 1 (meses 1–3):</w:t>
@@ -5616,6 +6151,7 @@
                 <w:rFonts w:ascii="Arial" w:hAnsi="Arial"/>
                 <w:b w:val="0"/>
                 <w:i w:val="0"/>
+                <w:color w:val="000000"/>
                 <w:sz w:val="16"/>
               </w:rPr>
               <w:t>Consolidar y limpiar la base de gasto; construir el árbol de categorías y el cubo; hacer el Pareto.</w:t>
@@ -5633,6 +6169,7 @@
                 <w:rFonts w:ascii="Arial" w:hAnsi="Arial"/>
                 <w:b w:val="0"/>
                 <w:i w:val="0"/>
+                <w:color w:val="000000"/>
                 <w:sz w:val="16"/>
               </w:rPr>
               <w:t>Analista de compras + TI</w:t>
@@ -5650,6 +6187,7 @@
                 <w:rFonts w:ascii="Arial" w:hAnsi="Arial"/>
                 <w:b w:val="0"/>
                 <w:i w:val="0"/>
+                <w:color w:val="000000"/>
                 <w:sz w:val="16"/>
               </w:rPr>
               <w:t>Base de gasto lista; % de datos limpios</w:t>
@@ -5667,6 +6205,7 @@
                 <w:rFonts w:ascii="Arial" w:hAnsi="Arial"/>
                 <w:b w:val="0"/>
                 <w:i w:val="0"/>
+                <w:color w:val="000000"/>
                 <w:sz w:val="16"/>
               </w:rPr>
               <w:t>Visibilidad real del gasto para decidir con evidencia.</w:t>
@@ -5686,6 +6225,7 @@
                 <w:rFonts w:ascii="Arial" w:hAnsi="Arial"/>
                 <w:b w:val="0"/>
                 <w:i w:val="0"/>
+                <w:color w:val="000000"/>
                 <w:sz w:val="16"/>
               </w:rPr>
               <w:t>Fase 2 (meses 4–8):</w:t>
@@ -5705,6 +6245,7 @@
                 <w:rFonts w:ascii="Arial" w:hAnsi="Arial"/>
                 <w:b w:val="0"/>
                 <w:i w:val="0"/>
+                <w:color w:val="000000"/>
                 <w:sz w:val="16"/>
               </w:rPr>
               <w:t>Contratos marco para paneles e inversores; dual sourcing; licitar estructuras y obra civil.</w:t>
@@ -5722,6 +6263,7 @@
                 <w:rFonts w:ascii="Arial" w:hAnsi="Arial"/>
                 <w:b w:val="0"/>
                 <w:i w:val="0"/>
+                <w:color w:val="000000"/>
                 <w:sz w:val="16"/>
               </w:rPr>
               <w:t>Jefe de abastecimiento</w:t>
@@ -5739,6 +6281,7 @@
                 <w:rFonts w:ascii="Arial" w:hAnsi="Arial"/>
                 <w:b w:val="0"/>
                 <w:i w:val="0"/>
+                <w:color w:val="000000"/>
                 <w:sz w:val="16"/>
               </w:rPr>
               <w:t>% gasto bajo contrato; ahorro vs. línea base; OTD</w:t>
@@ -5756,6 +6299,7 @@
                 <w:rFonts w:ascii="Arial" w:hAnsi="Arial"/>
                 <w:b w:val="0"/>
                 <w:i w:val="0"/>
+                <w:color w:val="000000"/>
                 <w:sz w:val="16"/>
               </w:rPr>
               <w:t>Ahorros del 8–12 % sobre el gasto impactado y menos urgencias.</w:t>
@@ -5775,6 +6319,7 @@
                 <w:rFonts w:ascii="Arial" w:hAnsi="Arial"/>
                 <w:b w:val="0"/>
                 <w:i w:val="0"/>
+                <w:color w:val="000000"/>
                 <w:sz w:val="16"/>
               </w:rPr>
               <w:t>Fase 3 (meses 9–12):</w:t>
@@ -5794,6 +6339,7 @@
                 <w:rFonts w:ascii="Arial" w:hAnsi="Arial"/>
                 <w:b w:val="0"/>
                 <w:i w:val="0"/>
+                <w:color w:val="000000"/>
                 <w:sz w:val="16"/>
               </w:rPr>
               <w:t>Formalizar política y RACI; implementar umbrales; tablero de KPIs; criterios ESG (ISO 20400).</w:t>
@@ -5811,6 +6357,7 @@
                 <w:rFonts w:ascii="Arial" w:hAnsi="Arial"/>
                 <w:b w:val="0"/>
                 <w:i w:val="0"/>
+                <w:color w:val="000000"/>
                 <w:sz w:val="16"/>
               </w:rPr>
               <w:t>Gerencia + Compras</w:t>
@@ -5828,6 +6375,7 @@
                 <w:rFonts w:ascii="Arial" w:hAnsi="Arial"/>
                 <w:b w:val="0"/>
                 <w:i w:val="0"/>
+                <w:color w:val="000000"/>
                 <w:sz w:val="16"/>
               </w:rPr>
               <w:t>% críticos con plan; % compras sostenibles</w:t>
@@ -5845,6 +6393,7 @@
                 <w:rFonts w:ascii="Arial" w:hAnsi="Arial"/>
                 <w:b w:val="0"/>
                 <w:i w:val="0"/>
+                <w:color w:val="000000"/>
                 <w:sz w:val="16"/>
               </w:rPr>
               <w:t>Proceso controlado, medible y alineado a la estrategia.</w:t>
@@ -5868,10 +6417,10 @@
           <w:rFonts w:ascii="Arial" w:hAnsi="Arial"/>
           <w:b w:val="0"/>
           <w:i/>
-          <w:color w:val="444444"/>
-          <w:sz w:val="17"/>
+          <w:color w:val="000000"/>
+          <w:sz w:val="18"/>
         </w:rPr>
-        <w:t>Tabla 9. Plan de transformación a 12 meses para Evolti.</w:t>
+        <w:t>Nota. Elaboración propia.</w:t>
       </w:r>
     </w:p>
     <w:p>
@@ -5884,8 +6433,8 @@
           <w:rFonts w:ascii="Arial" w:hAnsi="Arial"/>
           <w:b/>
           <w:i w:val="0"/>
-          <w:color w:val="0B6E4F"/>
-          <w:sz w:val="23"/>
+          <w:color w:val="000000"/>
+          <w:sz w:val="22"/>
         </w:rPr>
         <w:t>Riesgos del cambio</w:t>
       </w:r>
@@ -5900,6 +6449,7 @@
           <w:rFonts w:ascii="Arial" w:hAnsi="Arial"/>
           <w:b w:val="0"/>
           <w:i w:val="0"/>
+          <w:color w:val="000000"/>
           <w:sz w:val="22"/>
         </w:rPr>
         <w:t>Resistencia de los equipos de obra a seguir el nuevo proceso si lo ven como “más trámite”.</w:t>
@@ -5915,6 +6465,7 @@
           <w:rFonts w:ascii="Arial" w:hAnsi="Arial"/>
           <w:b w:val="0"/>
           <w:i w:val="0"/>
+          <w:color w:val="000000"/>
           <w:sz w:val="22"/>
         </w:rPr>
         <w:t>Falta de tiempo del equipo de compras para el análisis mientras siguen las tareas del día a día.</w:t>
@@ -5930,6 +6481,7 @@
           <w:rFonts w:ascii="Arial" w:hAnsi="Arial"/>
           <w:b w:val="0"/>
           <w:i w:val="0"/>
+          <w:color w:val="000000"/>
           <w:sz w:val="22"/>
         </w:rPr>
         <w:t>Calidad de los datos: si la base no se limpia bien, el análisis pierde credibilidad.</w:t>
@@ -5945,6 +6497,7 @@
           <w:rFonts w:ascii="Arial" w:hAnsi="Arial"/>
           <w:b w:val="0"/>
           <w:i w:val="0"/>
+          <w:color w:val="000000"/>
           <w:sz w:val="22"/>
         </w:rPr>
         <w:t>Que se busque solo el ahorro y se sacrifique la continuidad o la calidad (un riesgo que el módulo advierte).</w:t>
@@ -5959,6 +6512,7 @@
           <w:rFonts w:ascii="Arial" w:hAnsi="Arial"/>
           <w:b w:val="0"/>
           <w:i w:val="0"/>
+          <w:color w:val="000000"/>
           <w:sz w:val="22"/>
         </w:rPr>
         <w:t>Para mitigarlos propongo empezar por victorias tempranas (quick wins) que muestren beneficios rápidos, comunicar bien el porqué del cambio y apoyarse en la gerencia como patrocinadora.</w:t>
@@ -5968,14 +6522,15 @@
       <w:pPr>
         <w:keepNext/>
         <w:spacing w:before="280" w:after="120"/>
+        <w:jc w:val="center"/>
       </w:pPr>
       <w:r>
         <w:rPr>
           <w:rFonts w:ascii="Arial" w:hAnsi="Arial"/>
           <w:b/>
           <w:i w:val="0"/>
-          <w:color w:val="1F3864"/>
-          <w:sz w:val="26"/>
+          <w:color w:val="000000"/>
+          <w:sz w:val="24"/>
         </w:rPr>
         <w:t>9. Conclusiones estratégicas</w:t>
       </w:r>
@@ -5990,8 +6545,8 @@
           <w:rFonts w:ascii="Arial" w:hAnsi="Arial"/>
           <w:b/>
           <w:i w:val="0"/>
-          <w:color w:val="0B6E4F"/>
-          <w:sz w:val="23"/>
+          <w:color w:val="000000"/>
+          <w:sz w:val="22"/>
         </w:rPr>
         <w:t>¿Cómo pasa Evolti de compras tácticas a procurement estratégico?</w:t>
       </w:r>
@@ -6005,6 +6560,7 @@
           <w:rFonts w:ascii="Arial" w:hAnsi="Arial"/>
           <w:b w:val="0"/>
           <w:i w:val="0"/>
+          <w:color w:val="000000"/>
           <w:sz w:val="22"/>
         </w:rPr>
         <w:t>Según lo que aprendí en el módulo, una organización pasa de lo táctico a lo estratégico cuando tiene datos confiables, estructura (árbol y cubo), foco (Pareto), un alcance real (gasto impactado), validación por hipótesis antes de prometer ahorros, mecanismos de compra adecuados y control con precios de referencia y KPIs. Evolti puede recorrer ese camino con el plan de 12 meses: primero ordenando la información, luego segmentando el gasto y negociando de forma diferenciada según Kraljic, y finalmente institucionalizando el gobierno de compras y la medición. En otras palabras, se trata de que compras deje de “apagar incendios” y empiece a planificar.</w:t>
@@ -6020,8 +6576,8 @@
           <w:rFonts w:ascii="Arial" w:hAnsi="Arial"/>
           <w:b/>
           <w:i w:val="0"/>
-          <w:color w:val="0B6E4F"/>
-          <w:sz w:val="23"/>
+          <w:color w:val="000000"/>
+          <w:sz w:val="22"/>
         </w:rPr>
         <w:t>¿Qué impacto tendría sobre costos, riesgos y competitividad?</w:t>
       </w:r>
@@ -6036,6 +6592,7 @@
           <w:rFonts w:ascii="Arial" w:hAnsi="Arial"/>
           <w:b w:val="0"/>
           <w:i w:val="0"/>
+          <w:color w:val="000000"/>
           <w:sz w:val="22"/>
         </w:rPr>
         <w:t>Costos: ahorros estimados del 8–12 % sobre el gasto impactado en las categorías clave, además de menos sobrecostos por compras urgentes y penalidades.</w:t>
@@ -6051,6 +6608,7 @@
           <w:rFonts w:ascii="Arial" w:hAnsi="Arial"/>
           <w:b w:val="0"/>
           <w:i w:val="0"/>
+          <w:color w:val="000000"/>
           <w:sz w:val="22"/>
         </w:rPr>
         <w:t>Riesgos: mayor continuidad del suministro gracias al dual sourcing y a los planes de contingencia, y menor riesgo de integridad por la segregación de funciones y los controles.</w:t>
@@ -6066,6 +6624,7 @@
           <w:rFonts w:ascii="Arial" w:hAnsi="Arial"/>
           <w:b w:val="0"/>
           <w:i w:val="0"/>
+          <w:color w:val="000000"/>
           <w:sz w:val="22"/>
         </w:rPr>
         <w:t>Competitividad: al comprar mejor y a tiempo, Evolti puede cumplir cronogramas, presentar ofertas más competitivas en sus proyectos y sumar la sostenibilidad como un valor diferencial, algo cada vez más importante en el sector de energías renovables.</w:t>
@@ -6080,6 +6639,7 @@
           <w:rFonts w:ascii="Arial" w:hAnsi="Arial"/>
           <w:b w:val="0"/>
           <w:i w:val="0"/>
+          <w:color w:val="000000"/>
           <w:sz w:val="22"/>
         </w:rPr>
         <w:t>Como reflexión final, y hablando desde mi experiencia todavía corta en el área, creo que lo más valioso de este análisis es entender que el área de compras puede aportar mucho más que “conseguir cosas baratas”: bien organizada, se convierte en una palanca de valor para toda la empresa. Seguiré profundizando en estos temas a medida que gane experiencia.</w:t>
@@ -6094,81 +6654,170 @@
       <w:pPr>
         <w:keepNext/>
         <w:spacing w:before="280" w:after="120"/>
+        <w:jc w:val="center"/>
       </w:pPr>
       <w:r>
         <w:rPr>
           <w:rFonts w:ascii="Arial" w:hAnsi="Arial"/>
           <w:b/>
           <w:i w:val="0"/>
-          <w:color w:val="1F3864"/>
-          <w:sz w:val="26"/>
+          <w:color w:val="000000"/>
+          <w:sz w:val="24"/>
         </w:rPr>
         <w:t>Referencias</w:t>
       </w:r>
     </w:p>
     <w:p>
       <w:pPr>
-        <w:ind w:left="567" w:hanging="567"/>
-        <w:jc w:val="both"/>
+        <w:spacing w:line="360" w:lineRule="auto"/>
+        <w:ind w:left="720" w:hanging="720"/>
+        <w:jc w:val="left"/>
       </w:pPr>
       <w:r>
         <w:rPr>
           <w:rFonts w:ascii="Arial" w:hAnsi="Arial"/>
           <w:b w:val="0"/>
           <w:i w:val="0"/>
+          <w:color w:val="000000"/>
           <w:sz w:val="22"/>
         </w:rPr>
-        <w:t>Instituto Colombiano de Normas Técnicas y Certificación. (2017). NTC-ISO 20400: Compras sostenibles. Guía. ICONTEC.</w:t>
+        <w:t xml:space="preserve">Instituto Colombiano de Normas Técnicas y Certificación. (2017). </w:t>
+      </w:r>
+      <w:r>
+        <w:rPr>
+          <w:rFonts w:ascii="Arial" w:hAnsi="Arial"/>
+          <w:b w:val="0"/>
+          <w:i/>
+          <w:color w:val="000000"/>
+          <w:sz w:val="22"/>
+        </w:rPr>
+        <w:t>Norma Técnica Colombiana NTC-ISO 20400: Compras sostenibles. Guía</w:t>
+      </w:r>
+      <w:r>
+        <w:rPr>
+          <w:rFonts w:ascii="Arial" w:hAnsi="Arial"/>
+          <w:b w:val="0"/>
+          <w:i w:val="0"/>
+          <w:color w:val="000000"/>
+          <w:sz w:val="22"/>
+        </w:rPr>
+        <w:t>. ICONTEC.</w:t>
       </w:r>
     </w:p>
     <w:p>
       <w:pPr>
-        <w:ind w:left="567" w:hanging="567"/>
-        <w:jc w:val="both"/>
+        <w:spacing w:line="360" w:lineRule="auto"/>
+        <w:ind w:left="720" w:hanging="720"/>
+        <w:jc w:val="left"/>
       </w:pPr>
       <w:r>
         <w:rPr>
           <w:rFonts w:ascii="Arial" w:hAnsi="Arial"/>
           <w:b w:val="0"/>
           <w:i w:val="0"/>
+          <w:color w:val="000000"/>
           <w:sz w:val="22"/>
         </w:rPr>
-        <w:t>International Organization for Standardization. (2018). ISO 31000: Gestión del riesgo. Directrices. ISO.</w:t>
+        <w:t xml:space="preserve">Kraljic, P. (1983). Purchasing must become supply management. </w:t>
+      </w:r>
+      <w:r>
+        <w:rPr>
+          <w:rFonts w:ascii="Arial" w:hAnsi="Arial"/>
+          <w:b w:val="0"/>
+          <w:i/>
+          <w:color w:val="000000"/>
+          <w:sz w:val="22"/>
+        </w:rPr>
+        <w:t>Harvard Business Review, 61</w:t>
+      </w:r>
+      <w:r>
+        <w:rPr>
+          <w:rFonts w:ascii="Arial" w:hAnsi="Arial"/>
+          <w:b w:val="0"/>
+          <w:i w:val="0"/>
+          <w:color w:val="000000"/>
+          <w:sz w:val="22"/>
+        </w:rPr>
+        <w:t>(5), 109–117.</w:t>
       </w:r>
     </w:p>
     <w:p>
       <w:pPr>
-        <w:ind w:left="567" w:hanging="567"/>
-        <w:jc w:val="both"/>
+        <w:spacing w:line="360" w:lineRule="auto"/>
+        <w:ind w:left="720" w:hanging="720"/>
+        <w:jc w:val="left"/>
       </w:pPr>
       <w:r>
         <w:rPr>
           <w:rFonts w:ascii="Arial" w:hAnsi="Arial"/>
           <w:b w:val="0"/>
           <w:i w:val="0"/>
+          <w:color w:val="000000"/>
           <w:sz w:val="22"/>
         </w:rPr>
-        <w:t>Kraljic, P. (1983). Purchasing must become supply management. Harvard Business Review, 61(5), 109–117.</w:t>
+        <w:t xml:space="preserve">Organización Internacional de Normalización. (2018). </w:t>
+      </w:r>
+      <w:r>
+        <w:rPr>
+          <w:rFonts w:ascii="Arial" w:hAnsi="Arial"/>
+          <w:b w:val="0"/>
+          <w:i/>
+          <w:color w:val="000000"/>
+          <w:sz w:val="22"/>
+        </w:rPr>
+        <w:t>ISO 31000:2018. Gestión del riesgo. Directrices</w:t>
+      </w:r>
+      <w:r>
+        <w:rPr>
+          <w:rFonts w:ascii="Arial" w:hAnsi="Arial"/>
+          <w:b w:val="0"/>
+          <w:i w:val="0"/>
+          <w:color w:val="000000"/>
+          <w:sz w:val="22"/>
+        </w:rPr>
+        <w:t>. ISO.</w:t>
       </w:r>
     </w:p>
     <w:p>
       <w:pPr>
-        <w:ind w:left="567" w:hanging="567"/>
-        <w:jc w:val="both"/>
+        <w:spacing w:line="360" w:lineRule="auto"/>
+        <w:ind w:left="720" w:hanging="720"/>
+        <w:jc w:val="left"/>
       </w:pPr>
       <w:r>
         <w:rPr>
           <w:rFonts w:ascii="Arial" w:hAnsi="Arial"/>
           <w:b w:val="0"/>
           <w:i w:val="0"/>
+          <w:color w:val="000000"/>
           <w:sz w:val="22"/>
         </w:rPr>
-        <w:t>Pontificia Universidad Javeriana Cali. (2026). Módulo 1: Fundamentos del procurement estratégico [Material del Diplomado en Procurement Estratégico y Abastecimiento Sostenible]. Cali, Colombia.</w:t>
+        <w:t xml:space="preserve">Pontificia Universidad Javeriana Cali. (2026). </w:t>
+      </w:r>
+      <w:r>
+        <w:rPr>
+          <w:rFonts w:ascii="Arial" w:hAnsi="Arial"/>
+          <w:b w:val="0"/>
+          <w:i/>
+          <w:color w:val="000000"/>
+          <w:sz w:val="22"/>
+        </w:rPr>
+        <w:t>Módulo 1: Fundamentos del procurement estratégico</w:t>
+      </w:r>
+      <w:r>
+        <w:rPr>
+          <w:rFonts w:ascii="Arial" w:hAnsi="Arial"/>
+          <w:b w:val="0"/>
+          <w:i w:val="0"/>
+          <w:color w:val="000000"/>
+          <w:sz w:val="22"/>
+        </w:rPr>
+        <w:t xml:space="preserve"> [Material de clase del Diplomado en Procurement Estratégico y Abastecimiento Sostenible]. Cali, Colombia.</w:t>
       </w:r>
     </w:p>
     <w:sectPr>
       <w:pgSz w:w="12240" w:h="15840"/>
-      <w:pgMar w:top="1417" w:right="1701" w:bottom="1417" w:left="1701" w:header="720" w:footer="720" w:gutter="0"/>
+      <w:pgMar w:top="1440" w:right="1440" w:bottom="1440" w:left="1440" w:header="720" w:footer="720" w:gutter="0"/>
       <w:cols w:space="720"/>
       <w:docGrid w:linePitch="360"/>
     </w:sectPr>
@@ -6544,7 +7193,7 @@
     </w:pPr>
     <w:rPr>
       <w:rFonts w:ascii="Arial" w:hAnsi="Arial"/>
-      <w:color w:val="222222"/>
+      <w:color w:val="000000"/>
       <w:sz w:val="22"/>
     </w:rPr>
   </w:style>

</xml_diff>

<commit_message>
APA opcion A: citas en texto para las 4 fuentes + nombre Laura Sofia Salas en portada
</commit_message>
<xml_diff>
--- a/documentos-modulo1/Trabajo_Modulo1_Evolti.docx
+++ b/documentos-modulo1/Trabajo_Modulo1_Evolti.docx
@@ -63,7 +63,7 @@
           <w:color w:val="000000"/>
           <w:sz w:val="22"/>
         </w:rPr>
-        <w:t>[Tu nombre completo]</w:t>
+        <w:t>Laura Sofía Salas Rosero</w:t>
       </w:r>
     </w:p>
     <w:p>
@@ -240,7 +240,7 @@
           <w:color w:val="000000"/>
           <w:sz w:val="22"/>
         </w:rPr>
-        <w:t>Mi objetivo es aplicar los conceptos vistos en el Módulo 1 —la evolución del procurement estratégico, el rol estratégico del área de compras, el gobierno de compras (procurement governance), los KPIs y la gestión del gasto (spend analysis)— para elaborar un diagnóstico del modelo actual y proponer un plan de transformación que ayude a Evolti a pasar de un esquema táctico y reactivo hacia uno más estratégico y analítico. Aclaro que parte de las cifras que utilizo son estimaciones de trabajo (con fines académicos), porque todavía estoy conociendo a fondo la información y prefiero ser transparente en eso; sin embargo, los órdenes de magnitud son coherentes con lo que se observa en proyectos de este tipo.</w:t>
+        <w:t>Mi objetivo es aplicar los conceptos vistos en el Módulo 1 —la evolución del procurement estratégico, el rol estratégico del área de compras, el gobierno de compras (procurement governance), los KPIs y la gestión del gasto (spend analysis)— para elaborar un diagnóstico del modelo actual y proponer un plan de transformación que ayude a Evolti a pasar de un esquema táctico y reactivo hacia uno más estratégico y analítico. Para ello me apoyo principalmente en los contenidos del módulo (Pontificia Universidad Javeriana Cali, 2026) y en referentes clásicos de la disciplina, como el planteamiento de Kraljic (1983) sobre la transición del área de compras hacia la gestión estratégica del abastecimiento. Aclaro que parte de las cifras que utilizo son estimaciones de trabajo (con fines académicos), porque todavía estoy conociendo a fondo la información y prefiero ser transparente en eso; sin embargo, los órdenes de magnitud son coherentes con lo que se observa en proyectos de este tipo.</w:t>
       </w:r>
     </w:p>
     <w:p>
@@ -619,7 +619,7 @@
           <w:color w:val="000000"/>
           <w:sz w:val="22"/>
         </w:rPr>
-        <w:t>Utilizando la idea de la evolución del procurement vista en el módulo (el paso de un rol de “purchasing” meramente operativo hacia un “supply management” estratégico), ubico a Evolti en un nivel de madurez táctico–reactivo, con algunos avances puntuales. Es decir, compras cumple bien la función de “conseguir lo que se necesita”, pero todavía actúa más como un área que responde a pedidos que como un área que planifica y aporta valor estratégico. La Tabla 1 resume cómo veo cada dimensión.</w:t>
+        <w:t>Utilizando la idea de la evolución del procurement (Kraljic, 1983; Pontificia Universidad Javeriana Cali, 2026), es decir el paso de un rol de “purchasing” meramente operativo hacia un “supply management” estratégico, ubico a Evolti en un nivel de madurez táctico–reactivo, con algunos avances puntuales. Es decir, compras cumple bien la función de “conseguir lo que se necesita”, pero todavía actúa más como un área que responde a pedidos que como un área que planifica y aporta valor estratégico. La Tabla 1 resume cómo veo cada dimensión.</w:t>
       </w:r>
     </w:p>
     <w:p>
@@ -1190,7 +1190,7 @@
           <w:color w:val="000000"/>
           <w:sz w:val="22"/>
         </w:rPr>
-        <w:t>El maverick spend (compras que se hacen por fuera de los canales y contratos definidos) es un riesgo real en un entorno de obra, donde la presión por cumplir el cronograma lleva a “saltarse” el proceso. En Evolti esto se ve, por ejemplo, cuando un frente de obra compra directamente un material urgente sin pasar por compras. Además del sobrecosto, esto reduce el control y abre la puerta a riesgos de integridad, como adjudicar siempre al mismo proveedor sin comparar, o la falta de segregación de funciones (que la misma persona pida, apruebe y reciba). El módulo insiste en que la separación entre solicitar, adjudicar y pagar es clave para la transparencia.</w:t>
+        <w:t>El maverick spend (compras que se hacen por fuera de los canales y contratos definidos) es un riesgo real en un entorno de obra, donde la presión por cumplir el cronograma lleva a “saltarse” el proceso. En Evolti esto se ve, por ejemplo, cuando un frente de obra compra directamente un material urgente sin pasar por compras. Además del sobrecosto, esto reduce el control y abre la puerta a riesgos de integridad, como adjudicar siempre al mismo proveedor sin comparar, o la falta de segregación de funciones (que la misma persona pida, apruebe y reciba). La gestión de estos riesgos se alinea con los principios de la norma ISO 31000 (Organización Internacional de Normalización [ISO], 2018), que recomienda identificar, evaluar y tratar los riesgos de forma sistemática; en compras, la separación entre solicitar, adjudicar y pagar es una de las medidas de control más importantes para la transparencia.</w:t>
       </w:r>
     </w:p>
     <w:p>
@@ -1349,7 +1349,7 @@
           <w:color w:val="000000"/>
           <w:sz w:val="22"/>
         </w:rPr>
-        <w:t>Siguiendo el paso 1 de la metodología de gestión del gasto del módulo, organizo el gasto en un árbol de categorías (Categoría → Subcategoría). Esto da visibilidad y permite después aplicar estrategias diferenciadas. Diseñé cuatro categorías principales con dos subcategorías cada una, pensadas para el negocio de granjas solares (ver Tabla 2).</w:t>
+        <w:t>Siguiendo el paso 1 de la metodología de gestión del gasto del módulo (Pontificia Universidad Javeriana Cali, 2026), organizo el gasto en un árbol de categorías (Categoría → Subcategoría). Esto da visibilidad y permite después aplicar estrategias diferenciadas. Diseñé cuatro categorías principales con dos subcategorías cada una, pensadas para el negocio de granjas solares (ver Tabla 2).</w:t>
       </w:r>
     </w:p>
     <w:p>
@@ -1652,7 +1652,7 @@
           <w:color w:val="000000"/>
           <w:sz w:val="22"/>
         </w:rPr>
-        <w:t>Para este análisis parto de un universo de gasto anual estimado de $40.000 millones COP en compras y contratación de proyectos (cifra de trabajo con fines académicos). Aplico los pasos del módulo: cubo del gasto, Pareto, identificación de categorías estratégicas y gasto impactado.</w:t>
+        <w:t>Para este análisis parto de un universo de gasto anual estimado de $40.000 millones COP en compras y contratación de proyectos (cifra de trabajo con fines académicos). Aplico los pasos del módulo (Pontificia Universidad Javeriana Cali, 2026): cubo del gasto, Pareto, identificación de categorías estratégicas y gasto impactado.</w:t>
       </w:r>
     </w:p>
     <w:p>
@@ -3806,7 +3806,7 @@
           <w:color w:val="000000"/>
           <w:sz w:val="22"/>
         </w:rPr>
-        <w:t>Como se vio en el módulo, medir debe servir para decidir, y no todas las métricas son KPIs: un KPI es una métrica prioritaria ligada a un objetivo estratégico. Propongo cinco KPIs para Evolti, uno por cada dimensión solicitada (eficiencia, desempeño de proveedor, riesgo, cumplimiento y sostenibilidad), siguiendo la lógica de la ficha “diccionario de KPI” del módulo (ver Tabla 6).</w:t>
+        <w:t>Como se vio en el módulo (Pontificia Universidad Javeriana Cali, 2026), medir debe servir para decidir, y no todas las métricas son KPIs: un KPI es una métrica prioritaria ligada a un objetivo estratégico. Propongo cinco KPIs para Evolti, uno por cada dimensión solicitada (eficiencia, desempeño de proveedor, riesgo, cumplimiento y sostenibilidad), siguiendo la lógica de la ficha “diccionario de KPI” del módulo (ver Tabla 6).</w:t>
       </w:r>
     </w:p>
     <w:p>
@@ -4540,7 +4540,7 @@
           <w:color w:val="000000"/>
           <w:sz w:val="18"/>
         </w:rPr>
-        <w:t>Nota. Elaboración propia con base en la Tabla de KPI del Módulo 1 y en la NTC-ISO 20400 (ICONTEC, 2017).</w:t>
+        <w:t>Nota. Elaboración propia con base en la Tabla de KPI del Módulo 1 (Pontificia Universidad Javeriana Cali, 2026) y en la norma NTC-ISO 20400 sobre compras sostenibles (ICONTEC, 2017).</w:t>
       </w:r>
     </w:p>
     <w:p>
@@ -4555,7 +4555,7 @@
           <w:color w:val="000000"/>
           <w:sz w:val="22"/>
         </w:rPr>
-        <w:t>Cada KPI tendría metas tipo semáforo (verde/amarillo/rojo) para facilitar la lectura gerencial. También hay que cuidar los riesgos de los KPIs vistos en el módulo, como las “métricas vanidosas”, inflar ahorros por doble conteo o el greenwashing en sostenibilidad.</w:t>
+        <w:t>El KPI de sostenibilidad se apoya en la norma NTC-ISO 20400, que orienta cómo integrar criterios ambientales y sociales en las compras (ICONTEC, 2017). Cada KPI tendría metas tipo semáforo (verde/amarillo/rojo) para facilitar la lectura gerencial. También hay que cuidar los riesgos de los KPIs vistos en el módulo, como las “métricas vanidosas”, inflar ahorros por doble conteo o el greenwashing en sostenibilidad.</w:t>
       </w:r>
     </w:p>
     <w:p>
@@ -6563,7 +6563,7 @@
           <w:color w:val="000000"/>
           <w:sz w:val="22"/>
         </w:rPr>
-        <w:t>Según lo que aprendí en el módulo, una organización pasa de lo táctico a lo estratégico cuando tiene datos confiables, estructura (árbol y cubo), foco (Pareto), un alcance real (gasto impactado), validación por hipótesis antes de prometer ahorros, mecanismos de compra adecuados y control con precios de referencia y KPIs. Evolti puede recorrer ese camino con el plan de 12 meses: primero ordenando la información, luego segmentando el gasto y negociando de forma diferenciada según Kraljic, y finalmente institucionalizando el gobierno de compras y la medición. En otras palabras, se trata de que compras deje de “apagar incendios” y empiece a planificar.</w:t>
+        <w:t>Según lo aprendido en el módulo (Pontificia Universidad Javeriana Cali, 2026), una organización pasa de lo táctico a lo estratégico cuando tiene datos confiables, estructura (árbol y cubo), foco (Pareto), un alcance real (gasto impactado), validación por hipótesis antes de prometer ahorros, mecanismos de compra adecuados y control con precios de referencia y KPIs. Evolti puede recorrer ese camino con el plan de 12 meses: primero ordenando la información, luego segmentando el gasto y negociando de forma diferenciada según Kraljic (1983), y finalmente institucionalizando el gobierno de compras y la medición. En otras palabras, se trata de que compras deje de “apagar incendios” y empiece a planificar.</w:t>
       </w:r>
     </w:p>
     <w:p>

</xml_diff>